<commit_message>
Add 6 project topics, update groups (5 groups max 4 members), update assignment sheet
</commit_message>
<xml_diff>
--- a/CIE_Assignment_Sheet_PEMRT525.docx
+++ b/CIE_Assignment_Sheet_PEMRT525.docx
@@ -90,7 +90,7 @@
                 <w:sz w:val="22"/>
                 <w:szCs w:val="22"/>
               </w:rPr>
-              <w:t xml:space="preserve">CIE Assignment Sheet — Academic Year 2025–26</w:t>
+              <w:t xml:space="preserve">CIE Project Assignments — Academic Year 2025–26</w:t>
             </w:r>
           </w:p>
         </w:tc>
@@ -184,7 +184,7 @@
                 <w:sz w:val="20"/>
                 <w:szCs w:val="20"/>
               </w:rPr>
-              <w:t xml:space="preserve">• All assignments are individual unless stated otherwise.</w:t>
+              <w:t xml:space="preserve">• Projects are group submissions — all members must contribute equally.</w:t>
             </w:r>
           </w:p>
           <w:p>
@@ -203,7 +203,7 @@
                 <w:sz w:val="20"/>
                 <w:szCs w:val="20"/>
               </w:rPr>
-              <w:t xml:space="preserve">• Set A (Report) and Set B (Project) are separate submissions. Both must be completed.</w:t>
+              <w:t xml:space="preserve">• Plagiarism will result in zero marks. Code similarity &gt; 30% will be penalised.</w:t>
             </w:r>
           </w:p>
           <w:p>
@@ -222,7 +222,7 @@
                 <w:sz w:val="20"/>
                 <w:szCs w:val="20"/>
               </w:rPr>
-              <w:t xml:space="preserve">• Plagiarism will result in zero marks. Code similarity &gt; 30% will be penalised.</w:t>
+              <w:t xml:space="preserve">• Each project contributes to the 'Analyse' component (5 marks) of CIE.</w:t>
             </w:r>
           </w:p>
           <w:p>
@@ -241,7 +241,7 @@
                 <w:sz w:val="20"/>
                 <w:szCs w:val="20"/>
               </w:rPr>
-              <w:t xml:space="preserve">• Each assignment carries 5 marks. Total CIE contribution: Set A (10 marks) + Set B (10 marks) = 20 marks.</w:t>
+              <w:t xml:space="preserve">• Submission format: ZIP containing code + screenshots + demo video (max 2 min). Upload to GitHub classroom / LMS.</w:t>
             </w:r>
           </w:p>
           <w:p>
@@ -260,7 +260,7 @@
                 <w:sz w:val="20"/>
                 <w:szCs w:val="20"/>
               </w:rPr>
-              <w:t xml:space="preserve">• Submission format: PDF for reports; ZIP (code + screenshots) for projects. Upload to GitHub classroom / LMS.</w:t>
+              <w:t xml:space="preserve">• Group number = Project number (Group 1 → B1, Group 2 → B2, Group 3 → B3, Group 4 → B4, Group 5 → B5).</w:t>
             </w:r>
           </w:p>
         </w:tc>
@@ -310,7 +310,7 @@
               <w:bottom w:val="none" w:color="FFFFFF" w:sz="0"/>
               <w:right w:val="none" w:color="FFFFFF" w:sz="0"/>
             </w:tcBorders>
-            <w:shd w:fill="2E7D32" w:val="clear"/>
+            <w:shd w:fill="E65100" w:val="clear"/>
             <w:tcMar>
               <w:top w:type="dxa" w:w="80"/>
               <w:left w:type="dxa" w:w="120"/>
@@ -335,7 +335,7 @@
                 <w:sz w:val="28"/>
                 <w:szCs w:val="28"/>
               </w:rPr>
-              <w:t xml:space="preserve">SET A — REPORT ASSIGNMENTS</w:t>
+              <w:t xml:space="preserve">SET B — HANDS-ON PROJECTS</w:t>
             </w:r>
           </w:p>
           <w:p>
@@ -354,3038 +354,7 @@
                 <w:sz w:val="20"/>
                 <w:szCs w:val="20"/>
               </w:rPr>
-              <w:t xml:space="preserve">Theoretical analysis, literature review &amp; design reports  |  Submit as PDF  |  Minimum 5 pages each</w:t>
-            </w:r>
-          </w:p>
-        </w:tc>
-      </w:tr>
-    </w:tbl>
-    <w:p>
-      <w:pPr>
-        <w:spacing w:after="80" w:before="0"/>
-        <w:jc w:val="left"/>
-      </w:pPr>
-      <w:r>
-        <w:rPr>
-          <w:rFonts w:ascii="Arial" w:cs="Arial" w:eastAsia="Arial" w:hAnsi="Arial"/>
-          <w:b w:val="false"/>
-          <w:bCs w:val="false"/>
-          <w:i w:val="false"/>
-          <w:iCs w:val="false"/>
-          <w:color w:val="000000"/>
-          <w:sz w:val="22"/>
-          <w:szCs w:val="22"/>
-        </w:rPr>
-        <w:t xml:space="preserve"/>
-      </w:r>
-    </w:p>
-    <w:tbl>
-      <w:tblPr>
-        <w:tblW w:type="dxa" w:w="9360"/>
-        <w:tblBorders>
-          <w:top w:val="single" w:color="auto" w:sz="4"/>
-          <w:left w:val="single" w:color="auto" w:sz="4"/>
-          <w:bottom w:val="single" w:color="auto" w:sz="4"/>
-          <w:right w:val="single" w:color="auto" w:sz="4"/>
-          <w:insideH w:val="single" w:color="auto" w:sz="4"/>
-          <w:insideV w:val="single" w:color="auto" w:sz="4"/>
-        </w:tblBorders>
-      </w:tblPr>
-      <w:tblGrid>
-        <w:gridCol w:w="9360"/>
-      </w:tblGrid>
-      <w:tr>
-        <w:tc>
-          <w:tcPr>
-            <w:tcW w:type="dxa" w:w="9360"/>
-            <w:tcBorders>
-              <w:top w:val="single" w:color="CCCCCC" w:sz="1"/>
-              <w:left w:val="single" w:color="CCCCCC" w:sz="1"/>
-              <w:bottom w:val="single" w:color="CCCCCC" w:sz="1"/>
-              <w:right w:val="single" w:color="CCCCCC" w:sz="1"/>
-            </w:tcBorders>
-            <w:shd w:fill="FFFFFF" w:val="clear"/>
-            <w:tcMar>
-              <w:top w:type="dxa" w:w="80"/>
-              <w:left w:type="dxa" w:w="120"/>
-              <w:bottom w:type="dxa" w:w="80"/>
-              <w:right w:type="dxa" w:w="120"/>
-            </w:tcMar>
-            <w:vAlign w:val="top"/>
-          </w:tcPr>
-          <w:tbl>
-            <w:tblPr>
-              <w:tblW w:type="dxa" w:w="9260"/>
-              <w:tblBorders>
-                <w:top w:val="single" w:color="auto" w:sz="4"/>
-                <w:left w:val="single" w:color="auto" w:sz="4"/>
-                <w:bottom w:val="single" w:color="auto" w:sz="4"/>
-                <w:right w:val="single" w:color="auto" w:sz="4"/>
-                <w:insideH w:val="single" w:color="auto" w:sz="4"/>
-                <w:insideV w:val="single" w:color="auto" w:sz="4"/>
-              </w:tblBorders>
-              <w:tblCellMar>
-                <w:top w:type="dxa" w:w="0"/>
-                <w:left w:type="dxa" w:w="0"/>
-                <w:bottom w:type="dxa" w:w="0"/>
-                <w:right w:type="dxa" w:w="0"/>
-              </w:tblCellMar>
-            </w:tblPr>
-            <w:tblGrid>
-              <w:gridCol w:w="7560"/>
-              <w:gridCol w:w="1800"/>
-            </w:tblGrid>
-            <w:tr>
-              <w:tc>
-                <w:tcPr>
-                  <w:tcW w:type="dxa" w:w="7560"/>
-                  <w:tcBorders>
-                    <w:top w:val="single" w:color="CCCCCC" w:sz="1"/>
-                    <w:left w:val="single" w:color="CCCCCC" w:sz="1"/>
-                    <w:bottom w:val="single" w:color="CCCCCC" w:sz="1"/>
-                    <w:right w:val="single" w:color="CCCCCC" w:sz="1"/>
-                  </w:tcBorders>
-                  <w:shd w:fill="FFFFFF" w:val="clear"/>
-                  <w:tcMar>
-                    <w:top w:type="dxa" w:w="80"/>
-                    <w:left w:type="dxa" w:w="120"/>
-                    <w:bottom w:type="dxa" w:w="80"/>
-                    <w:right w:type="dxa" w:w="120"/>
-                  </w:tcMar>
-                  <w:vAlign w:val="top"/>
-                </w:tcPr>
-                <w:p>
-                  <w:pPr>
-                    <w:spacing w:after="20" w:before="0"/>
-                    <w:jc w:val="left"/>
-                  </w:pPr>
-                  <w:r>
-                    <w:rPr>
-                      <w:rFonts w:ascii="Arial" w:cs="Arial" w:eastAsia="Arial" w:hAnsi="Arial"/>
-                      <w:b/>
-                      <w:bCs/>
-                      <w:i w:val="false"/>
-                      <w:iCs w:val="false"/>
-                      <w:color w:val="2E7D32"/>
-                      <w:sz w:val="18"/>
-                      <w:szCs w:val="18"/>
-                    </w:rPr>
-                    <w:t xml:space="preserve">Assignment A1</w:t>
-                  </w:r>
-                  <w:r>
-                    <w:rPr>
-                      <w:rFonts w:ascii="Arial" w:cs="Arial" w:eastAsia="Arial" w:hAnsi="Arial"/>
-                      <w:b w:val="false"/>
-                      <w:bCs w:val="false"/>
-                      <w:i w:val="false"/>
-                      <w:iCs w:val="false"/>
-                      <w:color w:val="666666"/>
-                      <w:sz w:val="18"/>
-                      <w:szCs w:val="18"/>
-                    </w:rPr>
-                    <w:t xml:space="preserve">   |   Module 1   |   CO1</w:t>
-                  </w:r>
-                </w:p>
-                <w:p>
-                  <w:pPr>
-                    <w:spacing w:after="80" w:before="0"/>
-                    <w:jc w:val="left"/>
-                  </w:pPr>
-                  <w:r>
-                    <w:rPr>
-                      <w:rFonts w:ascii="Arial" w:cs="Arial" w:eastAsia="Arial" w:hAnsi="Arial"/>
-                      <w:b/>
-                      <w:bCs/>
-                      <w:i w:val="false"/>
-                      <w:iCs w:val="false"/>
-                      <w:color w:val="111111"/>
-                      <w:sz w:val="24"/>
-                      <w:szCs w:val="24"/>
-                    </w:rPr>
-                    <w:t xml:space="preserve">IoT Architecture Analysis of a Real Product</w:t>
-                  </w:r>
-                </w:p>
-              </w:tc>
-              <w:tc>
-                <w:tcPr>
-                  <w:tcW w:type="dxa" w:w="1800"/>
-                  <w:tcBorders>
-                    <w:top w:val="single" w:color="CCCCCC" w:sz="1"/>
-                    <w:left w:val="single" w:color="CCCCCC" w:sz="1"/>
-                    <w:bottom w:val="single" w:color="CCCCCC" w:sz="1"/>
-                    <w:right w:val="single" w:color="CCCCCC" w:sz="1"/>
-                  </w:tcBorders>
-                  <w:shd w:fill="FFFFFF" w:val="clear"/>
-                  <w:tcMar>
-                    <w:top w:type="dxa" w:w="80"/>
-                    <w:left w:type="dxa" w:w="120"/>
-                    <w:bottom w:type="dxa" w:w="80"/>
-                    <w:right w:type="dxa" w:w="120"/>
-                  </w:tcMar>
-                  <w:vAlign w:val="center"/>
-                </w:tcPr>
-                <w:p>
-                  <w:pPr>
-                    <w:spacing w:after="10" w:before="0"/>
-                    <w:jc w:val="left"/>
-                  </w:pPr>
-                  <w:r>
-                    <w:rPr>
-                      <w:rFonts w:ascii="Arial" w:cs="Arial" w:eastAsia="Arial" w:hAnsi="Arial"/>
-                      <w:b w:val="false"/>
-                      <w:bCs w:val="false"/>
-                      <w:i w:val="false"/>
-                      <w:iCs w:val="false"/>
-                      <w:color w:val="888888"/>
-                      <w:sz w:val="18"/>
-                      <w:szCs w:val="18"/>
-                    </w:rPr>
-                    <w:t xml:space="preserve">Marks</w:t>
-                  </w:r>
-                </w:p>
-                <w:p>
-                  <w:pPr>
-                    <w:spacing w:after="80" w:before="0"/>
-                    <w:jc w:val="left"/>
-                  </w:pPr>
-                  <w:r>
-                    <w:rPr>
-                      <w:rFonts w:ascii="Arial" w:cs="Arial" w:eastAsia="Arial" w:hAnsi="Arial"/>
-                      <w:b/>
-                      <w:bCs/>
-                      <w:i w:val="false"/>
-                      <w:iCs w:val="false"/>
-                      <w:color w:val="2E7D32"/>
-                      <w:sz w:val="32"/>
-                      <w:szCs w:val="32"/>
-                    </w:rPr>
-                    <w:t xml:space="preserve">10</w:t>
-                  </w:r>
-                </w:p>
-              </w:tc>
-            </w:tr>
-          </w:tbl>
-          <w:p/>
-        </w:tc>
-      </w:tr>
-      <w:tr>
-        <w:tc>
-          <w:tcPr>
-            <w:tcW w:type="dxa" w:w="9360"/>
-            <w:tcBorders>
-              <w:top w:val="none" w:color="FFFFFF" w:sz="0"/>
-              <w:left w:val="none" w:color="FFFFFF" w:sz="0"/>
-              <w:bottom w:val="none" w:color="FFFFFF" w:sz="0"/>
-              <w:right w:val="none" w:color="FFFFFF" w:sz="0"/>
-            </w:tcBorders>
-            <w:shd w:fill="2E7D32" w:val="clear"/>
-            <w:tcMar>
-              <w:top w:type="dxa" w:w="80"/>
-              <w:left w:type="dxa" w:w="120"/>
-              <w:bottom w:type="dxa" w:w="80"/>
-              <w:right w:type="dxa" w:w="120"/>
-            </w:tcMar>
-            <w:vAlign w:val="top"/>
-          </w:tcPr>
-          <w:p>
-            <w:pPr>
-              <w:spacing w:after="80" w:before="0"/>
-              <w:jc w:val="left"/>
-            </w:pPr>
-            <w:r>
-              <w:rPr>
-                <w:rFonts w:ascii="Arial" w:cs="Arial" w:eastAsia="Arial" w:hAnsi="Arial"/>
-                <w:b w:val="false"/>
-                <w:bCs w:val="false"/>
-                <w:i w:val="false"/>
-                <w:iCs w:val="false"/>
-                <w:color w:val="000000"/>
-                <w:sz w:val="22"/>
-                <w:szCs w:val="22"/>
-              </w:rPr>
-              <w:t xml:space="preserve"/>
-            </w:r>
-          </w:p>
-        </w:tc>
-      </w:tr>
-      <w:tr>
-        <w:tc>
-          <w:tcPr>
-            <w:tcW w:type="dxa" w:w="1800"/>
-            <w:tcBorders>
-              <w:top w:val="single" w:color="CCCCCC" w:sz="1"/>
-              <w:left w:val="single" w:color="CCCCCC" w:sz="1"/>
-              <w:bottom w:val="single" w:color="CCCCCC" w:sz="1"/>
-              <w:right w:val="single" w:color="CCCCCC" w:sz="1"/>
-            </w:tcBorders>
-            <w:shd w:fill="E8F5E9" w:val="clear"/>
-            <w:tcMar>
-              <w:top w:type="dxa" w:w="80"/>
-              <w:left w:type="dxa" w:w="120"/>
-              <w:bottom w:type="dxa" w:w="80"/>
-              <w:right w:type="dxa" w:w="120"/>
-            </w:tcMar>
-            <w:vAlign w:val="top"/>
-          </w:tcPr>
-          <w:p>
-            <w:pPr>
-              <w:spacing w:after="80" w:before="0"/>
-              <w:jc w:val="left"/>
-            </w:pPr>
-            <w:r>
-              <w:rPr>
-                <w:rFonts w:ascii="Arial" w:cs="Arial" w:eastAsia="Arial" w:hAnsi="Arial"/>
-                <w:b/>
-                <w:bCs/>
-                <w:i w:val="false"/>
-                <w:iCs w:val="false"/>
-                <w:color w:val="444444"/>
-                <w:sz w:val="19"/>
-                <w:szCs w:val="19"/>
-              </w:rPr>
-              <w:t xml:space="preserve">Tools</w:t>
-            </w:r>
-          </w:p>
-        </w:tc>
-        <w:tc>
-          <w:tcPr>
-            <w:tcW w:type="dxa" w:w="7560"/>
-            <w:tcBorders>
-              <w:top w:val="single" w:color="CCCCCC" w:sz="1"/>
-              <w:left w:val="single" w:color="CCCCCC" w:sz="1"/>
-              <w:bottom w:val="single" w:color="CCCCCC" w:sz="1"/>
-              <w:right w:val="single" w:color="CCCCCC" w:sz="1"/>
-            </w:tcBorders>
-            <w:shd w:fill="E8F5E9" w:val="clear"/>
-            <w:tcMar>
-              <w:top w:type="dxa" w:w="80"/>
-              <w:left w:type="dxa" w:w="120"/>
-              <w:bottom w:type="dxa" w:w="80"/>
-              <w:right w:type="dxa" w:w="120"/>
-            </w:tcMar>
-            <w:vAlign w:val="top"/>
-          </w:tcPr>
-          <w:p>
-            <w:pPr>
-              <w:spacing w:after="80" w:before="0"/>
-              <w:jc w:val="left"/>
-            </w:pPr>
-            <w:r>
-              <w:rPr>
-                <w:rFonts w:ascii="Arial" w:cs="Arial" w:eastAsia="Arial" w:hAnsi="Arial"/>
-                <w:b w:val="false"/>
-                <w:bCs w:val="false"/>
-                <w:i w:val="false"/>
-                <w:iCs w:val="false"/>
-                <w:color w:val="000000"/>
-                <w:sz w:val="19"/>
-                <w:szCs w:val="19"/>
-              </w:rPr>
-              <w:t xml:space="preserve">Internet research, drawing tool (draw.io / hand-drawn acceptable)</w:t>
-            </w:r>
-          </w:p>
-        </w:tc>
-      </w:tr>
-      <w:tr>
-        <w:tc>
-          <w:tcPr>
-            <w:tcW w:type="dxa" w:w="1800"/>
-            <w:tcBorders>
-              <w:top w:val="single" w:color="CCCCCC" w:sz="1"/>
-              <w:left w:val="single" w:color="CCCCCC" w:sz="1"/>
-              <w:bottom w:val="single" w:color="CCCCCC" w:sz="1"/>
-              <w:right w:val="single" w:color="CCCCCC" w:sz="1"/>
-            </w:tcBorders>
-            <w:shd w:fill="E8F5E9" w:val="clear"/>
-            <w:tcMar>
-              <w:top w:type="dxa" w:w="80"/>
-              <w:left w:type="dxa" w:w="120"/>
-              <w:bottom w:type="dxa" w:w="80"/>
-              <w:right w:type="dxa" w:w="120"/>
-            </w:tcMar>
-            <w:vAlign w:val="top"/>
-          </w:tcPr>
-          <w:p>
-            <w:pPr>
-              <w:spacing w:after="80" w:before="0"/>
-              <w:jc w:val="left"/>
-            </w:pPr>
-            <w:r>
-              <w:rPr>
-                <w:rFonts w:ascii="Arial" w:cs="Arial" w:eastAsia="Arial" w:hAnsi="Arial"/>
-                <w:b/>
-                <w:bCs/>
-                <w:i w:val="false"/>
-                <w:iCs w:val="false"/>
-                <w:color w:val="444444"/>
-                <w:sz w:val="19"/>
-                <w:szCs w:val="19"/>
-              </w:rPr>
-              <w:t xml:space="preserve">Description</w:t>
-            </w:r>
-          </w:p>
-        </w:tc>
-        <w:tc>
-          <w:tcPr>
-            <w:tcW w:type="dxa" w:w="7560"/>
-            <w:tcBorders>
-              <w:top w:val="single" w:color="CCCCCC" w:sz="1"/>
-              <w:left w:val="single" w:color="CCCCCC" w:sz="1"/>
-              <w:bottom w:val="single" w:color="CCCCCC" w:sz="1"/>
-              <w:right w:val="single" w:color="CCCCCC" w:sz="1"/>
-            </w:tcBorders>
-            <w:shd w:fill="E8F5E9" w:val="clear"/>
-            <w:tcMar>
-              <w:top w:type="dxa" w:w="80"/>
-              <w:left w:type="dxa" w:w="120"/>
-              <w:bottom w:type="dxa" w:w="80"/>
-              <w:right w:type="dxa" w:w="120"/>
-            </w:tcMar>
-            <w:vAlign w:val="top"/>
-          </w:tcPr>
-          <w:p>
-            <w:pPr>
-              <w:spacing w:after="80" w:before="0"/>
-              <w:jc w:val="left"/>
-            </w:pPr>
-            <w:r>
-              <w:rPr>
-                <w:rFonts w:ascii="Arial" w:cs="Arial" w:eastAsia="Arial" w:hAnsi="Arial"/>
-                <w:b w:val="false"/>
-                <w:bCs w:val="false"/>
-                <w:i w:val="false"/>
-                <w:iCs w:val="false"/>
-                <w:color w:val="000000"/>
-                <w:sz w:val="19"/>
-                <w:szCs w:val="19"/>
-              </w:rPr>
-              <w:t xml:space="preserve">Select any one real IoT product (e.g., Amazon Echo, Nest Thermostat, Philips Hue, smartwatch, smart meter). Analyse its architecture by mapping it to ALL of the following models studied in Module 1: (a) 3-Layer Architecture, (b) 5-Layer Architecture, and (c) CISCO 7-Level Architecture. Explain how each layer of the chosen product maps to the model. Justify with data flow and communication technologies used.</w:t>
-            </w:r>
-          </w:p>
-        </w:tc>
-      </w:tr>
-      <w:tr>
-        <w:tc>
-          <w:tcPr>
-            <w:tcW w:type="dxa" w:w="1800"/>
-            <w:tcBorders>
-              <w:top w:val="single" w:color="CCCCCC" w:sz="1"/>
-              <w:left w:val="single" w:color="CCCCCC" w:sz="1"/>
-              <w:bottom w:val="single" w:color="CCCCCC" w:sz="1"/>
-              <w:right w:val="single" w:color="CCCCCC" w:sz="1"/>
-            </w:tcBorders>
-            <w:shd w:fill="E8F5E9" w:val="clear"/>
-            <w:tcMar>
-              <w:top w:type="dxa" w:w="80"/>
-              <w:left w:type="dxa" w:w="120"/>
-              <w:bottom w:type="dxa" w:w="80"/>
-              <w:right w:type="dxa" w:w="120"/>
-            </w:tcMar>
-            <w:vAlign w:val="top"/>
-          </w:tcPr>
-          <w:p>
-            <w:pPr>
-              <w:spacing w:after="80" w:before="0"/>
-              <w:jc w:val="left"/>
-            </w:pPr>
-            <w:r>
-              <w:rPr>
-                <w:rFonts w:ascii="Arial" w:cs="Arial" w:eastAsia="Arial" w:hAnsi="Arial"/>
-                <w:b/>
-                <w:bCs/>
-                <w:i w:val="false"/>
-                <w:iCs w:val="false"/>
-                <w:color w:val="444444"/>
-                <w:sz w:val="19"/>
-                <w:szCs w:val="19"/>
-              </w:rPr>
-              <w:t xml:space="preserve">Deliverables</w:t>
-            </w:r>
-          </w:p>
-        </w:tc>
-        <w:tc>
-          <w:tcPr>
-            <w:tcW w:type="dxa" w:w="7560"/>
-            <w:tcBorders>
-              <w:top w:val="single" w:color="CCCCCC" w:sz="1"/>
-              <w:left w:val="single" w:color="CCCCCC" w:sz="1"/>
-              <w:bottom w:val="single" w:color="CCCCCC" w:sz="1"/>
-              <w:right w:val="single" w:color="CCCCCC" w:sz="1"/>
-            </w:tcBorders>
-            <w:shd w:fill="E8F5E9" w:val="clear"/>
-            <w:tcMar>
-              <w:top w:type="dxa" w:w="80"/>
-              <w:left w:type="dxa" w:w="120"/>
-              <w:bottom w:type="dxa" w:w="80"/>
-              <w:right w:type="dxa" w:w="120"/>
-            </w:tcMar>
-            <w:vAlign w:val="top"/>
-          </w:tcPr>
-          <w:p>
-            <w:pPr>
-              <w:spacing w:after="30" w:before="0"/>
-              <w:jc w:val="left"/>
-            </w:pPr>
-            <w:r>
-              <w:rPr>
-                <w:rFonts w:ascii="Arial" w:cs="Arial" w:eastAsia="Arial" w:hAnsi="Arial"/>
-                <w:b w:val="false"/>
-                <w:bCs w:val="false"/>
-                <w:i w:val="false"/>
-                <w:iCs w:val="false"/>
-                <w:color w:val="000000"/>
-                <w:sz w:val="19"/>
-                <w:szCs w:val="19"/>
-              </w:rPr>
-              <w:t xml:space="preserve">• Cover page — product name, image, brief product description (1 page)</w:t>
-            </w:r>
-          </w:p>
-          <w:p>
-            <w:pPr>
-              <w:spacing w:after="30" w:before="0"/>
-              <w:jc w:val="left"/>
-            </w:pPr>
-            <w:r>
-              <w:rPr>
-                <w:rFonts w:ascii="Arial" w:cs="Arial" w:eastAsia="Arial" w:hAnsi="Arial"/>
-                <w:b w:val="false"/>
-                <w:bCs w:val="false"/>
-                <w:i w:val="false"/>
-                <w:iCs w:val="false"/>
-                <w:color w:val="000000"/>
-                <w:sz w:val="19"/>
-                <w:szCs w:val="19"/>
-              </w:rPr>
-              <w:t xml:space="preserve">• 3-Layer Architecture mapping with diagram (1 page)</w:t>
-            </w:r>
-          </w:p>
-          <w:p>
-            <w:pPr>
-              <w:spacing w:after="30" w:before="0"/>
-              <w:jc w:val="left"/>
-            </w:pPr>
-            <w:r>
-              <w:rPr>
-                <w:rFonts w:ascii="Arial" w:cs="Arial" w:eastAsia="Arial" w:hAnsi="Arial"/>
-                <w:b w:val="false"/>
-                <w:bCs w:val="false"/>
-                <w:i w:val="false"/>
-                <w:iCs w:val="false"/>
-                <w:color w:val="000000"/>
-                <w:sz w:val="19"/>
-                <w:szCs w:val="19"/>
-              </w:rPr>
-              <w:t xml:space="preserve">• 5-Layer Architecture mapping with diagram (1 page)</w:t>
-            </w:r>
-          </w:p>
-          <w:p>
-            <w:pPr>
-              <w:spacing w:after="30" w:before="0"/>
-              <w:jc w:val="left"/>
-            </w:pPr>
-            <w:r>
-              <w:rPr>
-                <w:rFonts w:ascii="Arial" w:cs="Arial" w:eastAsia="Arial" w:hAnsi="Arial"/>
-                <w:b w:val="false"/>
-                <w:bCs w:val="false"/>
-                <w:i w:val="false"/>
-                <w:iCs w:val="false"/>
-                <w:color w:val="000000"/>
-                <w:sz w:val="19"/>
-                <w:szCs w:val="19"/>
-              </w:rPr>
-              <w:t xml:space="preserve">• CISCO 7-Level mapping with table and justification (1 page)</w:t>
-            </w:r>
-          </w:p>
-          <w:p>
-            <w:pPr>
-              <w:spacing w:after="30" w:before="0"/>
-              <w:jc w:val="left"/>
-            </w:pPr>
-            <w:r>
-              <w:rPr>
-                <w:rFonts w:ascii="Arial" w:cs="Arial" w:eastAsia="Arial" w:hAnsi="Arial"/>
-                <w:b w:val="false"/>
-                <w:bCs w:val="false"/>
-                <w:i w:val="false"/>
-                <w:iCs w:val="false"/>
-                <w:color w:val="000000"/>
-                <w:sz w:val="19"/>
-                <w:szCs w:val="19"/>
-              </w:rPr>
-              <w:t xml:space="preserve">• Comparison: which architecture best describes this product and why? (1 page)</w:t>
-            </w:r>
-          </w:p>
-          <w:p>
-            <w:pPr>
-              <w:spacing w:after="30" w:before="0"/>
-              <w:jc w:val="left"/>
-            </w:pPr>
-            <w:r>
-              <w:rPr>
-                <w:rFonts w:ascii="Arial" w:cs="Arial" w:eastAsia="Arial" w:hAnsi="Arial"/>
-                <w:b w:val="false"/>
-                <w:bCs w:val="false"/>
-                <w:i w:val="false"/>
-                <w:iCs w:val="false"/>
-                <w:color w:val="000000"/>
-                <w:sz w:val="19"/>
-                <w:szCs w:val="19"/>
-              </w:rPr>
-              <w:t xml:space="preserve">• References (IEEE/textbook citations)</w:t>
-            </w:r>
-          </w:p>
-        </w:tc>
-      </w:tr>
-    </w:tbl>
-    <w:p>
-      <w:pPr>
-        <w:spacing w:after="80" w:before="0"/>
-        <w:jc w:val="left"/>
-      </w:pPr>
-      <w:r>
-        <w:rPr>
-          <w:rFonts w:ascii="Arial" w:cs="Arial" w:eastAsia="Arial" w:hAnsi="Arial"/>
-          <w:b w:val="false"/>
-          <w:bCs w:val="false"/>
-          <w:i w:val="false"/>
-          <w:iCs w:val="false"/>
-          <w:color w:val="000000"/>
-          <w:sz w:val="22"/>
-          <w:szCs w:val="22"/>
-        </w:rPr>
-        <w:t xml:space="preserve"/>
-      </w:r>
-    </w:p>
-    <w:tbl>
-      <w:tblPr>
-        <w:tblW w:type="dxa" w:w="9360"/>
-        <w:tblBorders>
-          <w:top w:val="single" w:color="auto" w:sz="4"/>
-          <w:left w:val="single" w:color="auto" w:sz="4"/>
-          <w:bottom w:val="single" w:color="auto" w:sz="4"/>
-          <w:right w:val="single" w:color="auto" w:sz="4"/>
-          <w:insideH w:val="single" w:color="auto" w:sz="4"/>
-          <w:insideV w:val="single" w:color="auto" w:sz="4"/>
-        </w:tblBorders>
-      </w:tblPr>
-      <w:tblGrid>
-        <w:gridCol w:w="9360"/>
-      </w:tblGrid>
-      <w:tr>
-        <w:tc>
-          <w:tcPr>
-            <w:tcW w:type="dxa" w:w="9360"/>
-            <w:tcBorders>
-              <w:top w:val="single" w:color="CCCCCC" w:sz="1"/>
-              <w:left w:val="single" w:color="CCCCCC" w:sz="1"/>
-              <w:bottom w:val="single" w:color="CCCCCC" w:sz="1"/>
-              <w:right w:val="single" w:color="CCCCCC" w:sz="1"/>
-            </w:tcBorders>
-            <w:shd w:fill="FFFFFF" w:val="clear"/>
-            <w:tcMar>
-              <w:top w:type="dxa" w:w="80"/>
-              <w:left w:type="dxa" w:w="120"/>
-              <w:bottom w:type="dxa" w:w="80"/>
-              <w:right w:type="dxa" w:w="120"/>
-            </w:tcMar>
-            <w:vAlign w:val="top"/>
-          </w:tcPr>
-          <w:tbl>
-            <w:tblPr>
-              <w:tblW w:type="dxa" w:w="9260"/>
-              <w:tblBorders>
-                <w:top w:val="single" w:color="auto" w:sz="4"/>
-                <w:left w:val="single" w:color="auto" w:sz="4"/>
-                <w:bottom w:val="single" w:color="auto" w:sz="4"/>
-                <w:right w:val="single" w:color="auto" w:sz="4"/>
-                <w:insideH w:val="single" w:color="auto" w:sz="4"/>
-                <w:insideV w:val="single" w:color="auto" w:sz="4"/>
-              </w:tblBorders>
-              <w:tblCellMar>
-                <w:top w:type="dxa" w:w="0"/>
-                <w:left w:type="dxa" w:w="0"/>
-                <w:bottom w:type="dxa" w:w="0"/>
-                <w:right w:type="dxa" w:w="0"/>
-              </w:tblCellMar>
-            </w:tblPr>
-            <w:tblGrid>
-              <w:gridCol w:w="7560"/>
-              <w:gridCol w:w="1800"/>
-            </w:tblGrid>
-            <w:tr>
-              <w:tc>
-                <w:tcPr>
-                  <w:tcW w:type="dxa" w:w="7560"/>
-                  <w:tcBorders>
-                    <w:top w:val="single" w:color="CCCCCC" w:sz="1"/>
-                    <w:left w:val="single" w:color="CCCCCC" w:sz="1"/>
-                    <w:bottom w:val="single" w:color="CCCCCC" w:sz="1"/>
-                    <w:right w:val="single" w:color="CCCCCC" w:sz="1"/>
-                  </w:tcBorders>
-                  <w:shd w:fill="FFFFFF" w:val="clear"/>
-                  <w:tcMar>
-                    <w:top w:type="dxa" w:w="80"/>
-                    <w:left w:type="dxa" w:w="120"/>
-                    <w:bottom w:type="dxa" w:w="80"/>
-                    <w:right w:type="dxa" w:w="120"/>
-                  </w:tcMar>
-                  <w:vAlign w:val="top"/>
-                </w:tcPr>
-                <w:p>
-                  <w:pPr>
-                    <w:spacing w:after="20" w:before="0"/>
-                    <w:jc w:val="left"/>
-                  </w:pPr>
-                  <w:r>
-                    <w:rPr>
-                      <w:rFonts w:ascii="Arial" w:cs="Arial" w:eastAsia="Arial" w:hAnsi="Arial"/>
-                      <w:b/>
-                      <w:bCs/>
-                      <w:i w:val="false"/>
-                      <w:iCs w:val="false"/>
-                      <w:color w:val="2E7D32"/>
-                      <w:sz w:val="18"/>
-                      <w:szCs w:val="18"/>
-                    </w:rPr>
-                    <w:t xml:space="preserve">Assignment A2</w:t>
-                  </w:r>
-                  <w:r>
-                    <w:rPr>
-                      <w:rFonts w:ascii="Arial" w:cs="Arial" w:eastAsia="Arial" w:hAnsi="Arial"/>
-                      <w:b w:val="false"/>
-                      <w:bCs w:val="false"/>
-                      <w:i w:val="false"/>
-                      <w:iCs w:val="false"/>
-                      <w:color w:val="666666"/>
-                      <w:sz w:val="18"/>
-                      <w:szCs w:val="18"/>
-                    </w:rPr>
-                    <w:t xml:space="preserve">   |   Module 1   |   CO1</w:t>
-                  </w:r>
-                </w:p>
-                <w:p>
-                  <w:pPr>
-                    <w:spacing w:after="80" w:before="0"/>
-                    <w:jc w:val="left"/>
-                  </w:pPr>
-                  <w:r>
-                    <w:rPr>
-                      <w:rFonts w:ascii="Arial" w:cs="Arial" w:eastAsia="Arial" w:hAnsi="Arial"/>
-                      <w:b/>
-                      <w:bCs/>
-                      <w:i w:val="false"/>
-                      <w:iCs w:val="false"/>
-                      <w:color w:val="111111"/>
-                      <w:sz w:val="24"/>
-                      <w:szCs w:val="24"/>
-                    </w:rPr>
-                    <w:t xml:space="preserve">IoT Level Classification and Deployment Template Analysis</w:t>
-                  </w:r>
-                </w:p>
-              </w:tc>
-              <w:tc>
-                <w:tcPr>
-                  <w:tcW w:type="dxa" w:w="1800"/>
-                  <w:tcBorders>
-                    <w:top w:val="single" w:color="CCCCCC" w:sz="1"/>
-                    <w:left w:val="single" w:color="CCCCCC" w:sz="1"/>
-                    <w:bottom w:val="single" w:color="CCCCCC" w:sz="1"/>
-                    <w:right w:val="single" w:color="CCCCCC" w:sz="1"/>
-                  </w:tcBorders>
-                  <w:shd w:fill="FFFFFF" w:val="clear"/>
-                  <w:tcMar>
-                    <w:top w:type="dxa" w:w="80"/>
-                    <w:left w:type="dxa" w:w="120"/>
-                    <w:bottom w:type="dxa" w:w="80"/>
-                    <w:right w:type="dxa" w:w="120"/>
-                  </w:tcMar>
-                  <w:vAlign w:val="center"/>
-                </w:tcPr>
-                <w:p>
-                  <w:pPr>
-                    <w:spacing w:after="10" w:before="0"/>
-                    <w:jc w:val="left"/>
-                  </w:pPr>
-                  <w:r>
-                    <w:rPr>
-                      <w:rFonts w:ascii="Arial" w:cs="Arial" w:eastAsia="Arial" w:hAnsi="Arial"/>
-                      <w:b w:val="false"/>
-                      <w:bCs w:val="false"/>
-                      <w:i w:val="false"/>
-                      <w:iCs w:val="false"/>
-                      <w:color w:val="888888"/>
-                      <w:sz w:val="18"/>
-                      <w:szCs w:val="18"/>
-                    </w:rPr>
-                    <w:t xml:space="preserve">Marks</w:t>
-                  </w:r>
-                </w:p>
-                <w:p>
-                  <w:pPr>
-                    <w:spacing w:after="80" w:before="0"/>
-                    <w:jc w:val="left"/>
-                  </w:pPr>
-                  <w:r>
-                    <w:rPr>
-                      <w:rFonts w:ascii="Arial" w:cs="Arial" w:eastAsia="Arial" w:hAnsi="Arial"/>
-                      <w:b/>
-                      <w:bCs/>
-                      <w:i w:val="false"/>
-                      <w:iCs w:val="false"/>
-                      <w:color w:val="2E7D32"/>
-                      <w:sz w:val="32"/>
-                      <w:szCs w:val="32"/>
-                    </w:rPr>
-                    <w:t xml:space="preserve">10</w:t>
-                  </w:r>
-                </w:p>
-              </w:tc>
-            </w:tr>
-          </w:tbl>
-          <w:p/>
-        </w:tc>
-      </w:tr>
-      <w:tr>
-        <w:tc>
-          <w:tcPr>
-            <w:tcW w:type="dxa" w:w="9360"/>
-            <w:tcBorders>
-              <w:top w:val="none" w:color="FFFFFF" w:sz="0"/>
-              <w:left w:val="none" w:color="FFFFFF" w:sz="0"/>
-              <w:bottom w:val="none" w:color="FFFFFF" w:sz="0"/>
-              <w:right w:val="none" w:color="FFFFFF" w:sz="0"/>
-            </w:tcBorders>
-            <w:shd w:fill="2E7D32" w:val="clear"/>
-            <w:tcMar>
-              <w:top w:type="dxa" w:w="80"/>
-              <w:left w:type="dxa" w:w="120"/>
-              <w:bottom w:type="dxa" w:w="80"/>
-              <w:right w:type="dxa" w:w="120"/>
-            </w:tcMar>
-            <w:vAlign w:val="top"/>
-          </w:tcPr>
-          <w:p>
-            <w:pPr>
-              <w:spacing w:after="80" w:before="0"/>
-              <w:jc w:val="left"/>
-            </w:pPr>
-            <w:r>
-              <w:rPr>
-                <w:rFonts w:ascii="Arial" w:cs="Arial" w:eastAsia="Arial" w:hAnsi="Arial"/>
-                <w:b w:val="false"/>
-                <w:bCs w:val="false"/>
-                <w:i w:val="false"/>
-                <w:iCs w:val="false"/>
-                <w:color w:val="000000"/>
-                <w:sz w:val="22"/>
-                <w:szCs w:val="22"/>
-              </w:rPr>
-              <w:t xml:space="preserve"/>
-            </w:r>
-          </w:p>
-        </w:tc>
-      </w:tr>
-      <w:tr>
-        <w:tc>
-          <w:tcPr>
-            <w:tcW w:type="dxa" w:w="1800"/>
-            <w:tcBorders>
-              <w:top w:val="single" w:color="CCCCCC" w:sz="1"/>
-              <w:left w:val="single" w:color="CCCCCC" w:sz="1"/>
-              <w:bottom w:val="single" w:color="CCCCCC" w:sz="1"/>
-              <w:right w:val="single" w:color="CCCCCC" w:sz="1"/>
-            </w:tcBorders>
-            <w:shd w:fill="E8F5E9" w:val="clear"/>
-            <w:tcMar>
-              <w:top w:type="dxa" w:w="80"/>
-              <w:left w:type="dxa" w:w="120"/>
-              <w:bottom w:type="dxa" w:w="80"/>
-              <w:right w:type="dxa" w:w="120"/>
-            </w:tcMar>
-            <w:vAlign w:val="top"/>
-          </w:tcPr>
-          <w:p>
-            <w:pPr>
-              <w:spacing w:after="80" w:before="0"/>
-              <w:jc w:val="left"/>
-            </w:pPr>
-            <w:r>
-              <w:rPr>
-                <w:rFonts w:ascii="Arial" w:cs="Arial" w:eastAsia="Arial" w:hAnsi="Arial"/>
-                <w:b/>
-                <w:bCs/>
-                <w:i w:val="false"/>
-                <w:iCs w:val="false"/>
-                <w:color w:val="444444"/>
-                <w:sz w:val="19"/>
-                <w:szCs w:val="19"/>
-              </w:rPr>
-              <w:t xml:space="preserve">Tools</w:t>
-            </w:r>
-          </w:p>
-        </w:tc>
-        <w:tc>
-          <w:tcPr>
-            <w:tcW w:type="dxa" w:w="7560"/>
-            <w:tcBorders>
-              <w:top w:val="single" w:color="CCCCCC" w:sz="1"/>
-              <w:left w:val="single" w:color="CCCCCC" w:sz="1"/>
-              <w:bottom w:val="single" w:color="CCCCCC" w:sz="1"/>
-              <w:right w:val="single" w:color="CCCCCC" w:sz="1"/>
-            </w:tcBorders>
-            <w:shd w:fill="E8F5E9" w:val="clear"/>
-            <w:tcMar>
-              <w:top w:type="dxa" w:w="80"/>
-              <w:left w:type="dxa" w:w="120"/>
-              <w:bottom w:type="dxa" w:w="80"/>
-              <w:right w:type="dxa" w:w="120"/>
-            </w:tcMar>
-            <w:vAlign w:val="top"/>
-          </w:tcPr>
-          <w:p>
-            <w:pPr>
-              <w:spacing w:after="80" w:before="0"/>
-              <w:jc w:val="left"/>
-            </w:pPr>
-            <w:r>
-              <w:rPr>
-                <w:rFonts w:ascii="Arial" w:cs="Arial" w:eastAsia="Arial" w:hAnsi="Arial"/>
-                <w:b w:val="false"/>
-                <w:bCs w:val="false"/>
-                <w:i w:val="false"/>
-                <w:iCs w:val="false"/>
-                <w:color w:val="000000"/>
-                <w:sz w:val="19"/>
-                <w:szCs w:val="19"/>
-              </w:rPr>
-              <w:t xml:space="preserve">IoT textbooks (TB1 — Bahga &amp; Madisetti), internet research</w:t>
-            </w:r>
-          </w:p>
-        </w:tc>
-      </w:tr>
-      <w:tr>
-        <w:tc>
-          <w:tcPr>
-            <w:tcW w:type="dxa" w:w="1800"/>
-            <w:tcBorders>
-              <w:top w:val="single" w:color="CCCCCC" w:sz="1"/>
-              <w:left w:val="single" w:color="CCCCCC" w:sz="1"/>
-              <w:bottom w:val="single" w:color="CCCCCC" w:sz="1"/>
-              <w:right w:val="single" w:color="CCCCCC" w:sz="1"/>
-            </w:tcBorders>
-            <w:shd w:fill="E8F5E9" w:val="clear"/>
-            <w:tcMar>
-              <w:top w:type="dxa" w:w="80"/>
-              <w:left w:type="dxa" w:w="120"/>
-              <w:bottom w:type="dxa" w:w="80"/>
-              <w:right w:type="dxa" w:w="120"/>
-            </w:tcMar>
-            <w:vAlign w:val="top"/>
-          </w:tcPr>
-          <w:p>
-            <w:pPr>
-              <w:spacing w:after="80" w:before="0"/>
-              <w:jc w:val="left"/>
-            </w:pPr>
-            <w:r>
-              <w:rPr>
-                <w:rFonts w:ascii="Arial" w:cs="Arial" w:eastAsia="Arial" w:hAnsi="Arial"/>
-                <w:b/>
-                <w:bCs/>
-                <w:i w:val="false"/>
-                <w:iCs w:val="false"/>
-                <w:color w:val="444444"/>
-                <w:sz w:val="19"/>
-                <w:szCs w:val="19"/>
-              </w:rPr>
-              <w:t xml:space="preserve">Description</w:t>
-            </w:r>
-          </w:p>
-        </w:tc>
-        <w:tc>
-          <w:tcPr>
-            <w:tcW w:type="dxa" w:w="7560"/>
-            <w:tcBorders>
-              <w:top w:val="single" w:color="CCCCCC" w:sz="1"/>
-              <w:left w:val="single" w:color="CCCCCC" w:sz="1"/>
-              <w:bottom w:val="single" w:color="CCCCCC" w:sz="1"/>
-              <w:right w:val="single" w:color="CCCCCC" w:sz="1"/>
-            </w:tcBorders>
-            <w:shd w:fill="E8F5E9" w:val="clear"/>
-            <w:tcMar>
-              <w:top w:type="dxa" w:w="80"/>
-              <w:left w:type="dxa" w:w="120"/>
-              <w:bottom w:type="dxa" w:w="80"/>
-              <w:right w:type="dxa" w:w="120"/>
-            </w:tcMar>
-            <w:vAlign w:val="top"/>
-          </w:tcPr>
-          <w:p>
-            <w:pPr>
-              <w:spacing w:after="80" w:before="0"/>
-              <w:jc w:val="left"/>
-            </w:pPr>
-            <w:r>
-              <w:rPr>
-                <w:rFonts w:ascii="Arial" w:cs="Arial" w:eastAsia="Arial" w:hAnsi="Arial"/>
-                <w:b w:val="false"/>
-                <w:bCs w:val="false"/>
-                <w:i w:val="false"/>
-                <w:iCs w:val="false"/>
-                <w:color w:val="000000"/>
-                <w:sz w:val="19"/>
-                <w:szCs w:val="19"/>
-              </w:rPr>
-              <w:t xml:space="preserve">Select THREE different IoT systems from the list below and classify each into IoT Levels 1–6 (as defined by Bahga &amp; Madisetti). For each, identify: the appropriate deployment template, number of nodes, data volume, cloud dependency, and end-user application type. Options: Smart Parking System / Smart Grid Meter / Industrial Robot Monitoring / Agricultural Soil Sensor Network / Home Security Camera / Wearable Health Monitor.</w:t>
-            </w:r>
-          </w:p>
-        </w:tc>
-      </w:tr>
-      <w:tr>
-        <w:tc>
-          <w:tcPr>
-            <w:tcW w:type="dxa" w:w="1800"/>
-            <w:tcBorders>
-              <w:top w:val="single" w:color="CCCCCC" w:sz="1"/>
-              <w:left w:val="single" w:color="CCCCCC" w:sz="1"/>
-              <w:bottom w:val="single" w:color="CCCCCC" w:sz="1"/>
-              <w:right w:val="single" w:color="CCCCCC" w:sz="1"/>
-            </w:tcBorders>
-            <w:shd w:fill="E8F5E9" w:val="clear"/>
-            <w:tcMar>
-              <w:top w:type="dxa" w:w="80"/>
-              <w:left w:type="dxa" w:w="120"/>
-              <w:bottom w:type="dxa" w:w="80"/>
-              <w:right w:type="dxa" w:w="120"/>
-            </w:tcMar>
-            <w:vAlign w:val="top"/>
-          </w:tcPr>
-          <w:p>
-            <w:pPr>
-              <w:spacing w:after="80" w:before="0"/>
-              <w:jc w:val="left"/>
-            </w:pPr>
-            <w:r>
-              <w:rPr>
-                <w:rFonts w:ascii="Arial" w:cs="Arial" w:eastAsia="Arial" w:hAnsi="Arial"/>
-                <w:b/>
-                <w:bCs/>
-                <w:i w:val="false"/>
-                <w:iCs w:val="false"/>
-                <w:color w:val="444444"/>
-                <w:sz w:val="19"/>
-                <w:szCs w:val="19"/>
-              </w:rPr>
-              <w:t xml:space="preserve">Deliverables</w:t>
-            </w:r>
-          </w:p>
-        </w:tc>
-        <w:tc>
-          <w:tcPr>
-            <w:tcW w:type="dxa" w:w="7560"/>
-            <w:tcBorders>
-              <w:top w:val="single" w:color="CCCCCC" w:sz="1"/>
-              <w:left w:val="single" w:color="CCCCCC" w:sz="1"/>
-              <w:bottom w:val="single" w:color="CCCCCC" w:sz="1"/>
-              <w:right w:val="single" w:color="CCCCCC" w:sz="1"/>
-            </w:tcBorders>
-            <w:shd w:fill="E8F5E9" w:val="clear"/>
-            <w:tcMar>
-              <w:top w:type="dxa" w:w="80"/>
-              <w:left w:type="dxa" w:w="120"/>
-              <w:bottom w:type="dxa" w:w="80"/>
-              <w:right w:type="dxa" w:w="120"/>
-            </w:tcMar>
-            <w:vAlign w:val="top"/>
-          </w:tcPr>
-          <w:p>
-            <w:pPr>
-              <w:spacing w:after="30" w:before="0"/>
-              <w:jc w:val="left"/>
-            </w:pPr>
-            <w:r>
-              <w:rPr>
-                <w:rFonts w:ascii="Arial" w:cs="Arial" w:eastAsia="Arial" w:hAnsi="Arial"/>
-                <w:b w:val="false"/>
-                <w:bCs w:val="false"/>
-                <w:i w:val="false"/>
-                <w:iCs w:val="false"/>
-                <w:color w:val="000000"/>
-                <w:sz w:val="19"/>
-                <w:szCs w:val="19"/>
-              </w:rPr>
-              <w:t xml:space="preserve">• Brief description of all three chosen systems (1 page)</w:t>
-            </w:r>
-          </w:p>
-          <w:p>
-            <w:pPr>
-              <w:spacing w:after="30" w:before="0"/>
-              <w:jc w:val="left"/>
-            </w:pPr>
-            <w:r>
-              <w:rPr>
-                <w:rFonts w:ascii="Arial" w:cs="Arial" w:eastAsia="Arial" w:hAnsi="Arial"/>
-                <w:b w:val="false"/>
-                <w:bCs w:val="false"/>
-                <w:i w:val="false"/>
-                <w:iCs w:val="false"/>
-                <w:color w:val="000000"/>
-                <w:sz w:val="19"/>
-                <w:szCs w:val="19"/>
-              </w:rPr>
-              <w:t xml:space="preserve">• Level classification with full justification for each system — data flow diagram (2 pages)</w:t>
-            </w:r>
-          </w:p>
-          <w:p>
-            <w:pPr>
-              <w:spacing w:after="30" w:before="0"/>
-              <w:jc w:val="left"/>
-            </w:pPr>
-            <w:r>
-              <w:rPr>
-                <w:rFonts w:ascii="Arial" w:cs="Arial" w:eastAsia="Arial" w:hAnsi="Arial"/>
-                <w:b w:val="false"/>
-                <w:bCs w:val="false"/>
-                <w:i w:val="false"/>
-                <w:iCs w:val="false"/>
-                <w:color w:val="000000"/>
-                <w:sz w:val="19"/>
-                <w:szCs w:val="19"/>
-              </w:rPr>
-              <w:t xml:space="preserve">• Deployment template identification — routing, storage, analytics layer (1 page)</w:t>
-            </w:r>
-          </w:p>
-          <w:p>
-            <w:pPr>
-              <w:spacing w:after="30" w:before="0"/>
-              <w:jc w:val="left"/>
-            </w:pPr>
-            <w:r>
-              <w:rPr>
-                <w:rFonts w:ascii="Arial" w:cs="Arial" w:eastAsia="Arial" w:hAnsi="Arial"/>
-                <w:b w:val="false"/>
-                <w:bCs w:val="false"/>
-                <w:i w:val="false"/>
-                <w:iCs w:val="false"/>
-                <w:color w:val="000000"/>
-                <w:sz w:val="19"/>
-                <w:szCs w:val="19"/>
-              </w:rPr>
-              <w:t xml:space="preserve">• Comparison table: Level | Nodes | Cloud Dependency | Real-time need | Use Case (1 page)</w:t>
-            </w:r>
-          </w:p>
-          <w:p>
-            <w:pPr>
-              <w:spacing w:after="30" w:before="0"/>
-              <w:jc w:val="left"/>
-            </w:pPr>
-            <w:r>
-              <w:rPr>
-                <w:rFonts w:ascii="Arial" w:cs="Arial" w:eastAsia="Arial" w:hAnsi="Arial"/>
-                <w:b w:val="false"/>
-                <w:bCs w:val="false"/>
-                <w:i w:val="false"/>
-                <w:iCs w:val="false"/>
-                <w:color w:val="000000"/>
-                <w:sz w:val="19"/>
-                <w:szCs w:val="19"/>
-              </w:rPr>
-              <w:t xml:space="preserve">• Conclusion: which level is most commonly deployed in real industry and why?</w:t>
-            </w:r>
-          </w:p>
-        </w:tc>
-      </w:tr>
-    </w:tbl>
-    <w:p>
-      <w:pPr>
-        <w:spacing w:after="80" w:before="0"/>
-        <w:jc w:val="left"/>
-      </w:pPr>
-      <w:r>
-        <w:rPr>
-          <w:rFonts w:ascii="Arial" w:cs="Arial" w:eastAsia="Arial" w:hAnsi="Arial"/>
-          <w:b w:val="false"/>
-          <w:bCs w:val="false"/>
-          <w:i w:val="false"/>
-          <w:iCs w:val="false"/>
-          <w:color w:val="000000"/>
-          <w:sz w:val="22"/>
-          <w:szCs w:val="22"/>
-        </w:rPr>
-        <w:t xml:space="preserve"/>
-      </w:r>
-    </w:p>
-    <w:tbl>
-      <w:tblPr>
-        <w:tblW w:type="dxa" w:w="9360"/>
-        <w:tblBorders>
-          <w:top w:val="single" w:color="auto" w:sz="4"/>
-          <w:left w:val="single" w:color="auto" w:sz="4"/>
-          <w:bottom w:val="single" w:color="auto" w:sz="4"/>
-          <w:right w:val="single" w:color="auto" w:sz="4"/>
-          <w:insideH w:val="single" w:color="auto" w:sz="4"/>
-          <w:insideV w:val="single" w:color="auto" w:sz="4"/>
-        </w:tblBorders>
-      </w:tblPr>
-      <w:tblGrid>
-        <w:gridCol w:w="9360"/>
-      </w:tblGrid>
-      <w:tr>
-        <w:tc>
-          <w:tcPr>
-            <w:tcW w:type="dxa" w:w="9360"/>
-            <w:tcBorders>
-              <w:top w:val="single" w:color="CCCCCC" w:sz="1"/>
-              <w:left w:val="single" w:color="CCCCCC" w:sz="1"/>
-              <w:bottom w:val="single" w:color="CCCCCC" w:sz="1"/>
-              <w:right w:val="single" w:color="CCCCCC" w:sz="1"/>
-            </w:tcBorders>
-            <w:shd w:fill="FFFFFF" w:val="clear"/>
-            <w:tcMar>
-              <w:top w:type="dxa" w:w="80"/>
-              <w:left w:type="dxa" w:w="120"/>
-              <w:bottom w:type="dxa" w:w="80"/>
-              <w:right w:type="dxa" w:w="120"/>
-            </w:tcMar>
-            <w:vAlign w:val="top"/>
-          </w:tcPr>
-          <w:tbl>
-            <w:tblPr>
-              <w:tblW w:type="dxa" w:w="9260"/>
-              <w:tblBorders>
-                <w:top w:val="single" w:color="auto" w:sz="4"/>
-                <w:left w:val="single" w:color="auto" w:sz="4"/>
-                <w:bottom w:val="single" w:color="auto" w:sz="4"/>
-                <w:right w:val="single" w:color="auto" w:sz="4"/>
-                <w:insideH w:val="single" w:color="auto" w:sz="4"/>
-                <w:insideV w:val="single" w:color="auto" w:sz="4"/>
-              </w:tblBorders>
-              <w:tblCellMar>
-                <w:top w:type="dxa" w:w="0"/>
-                <w:left w:type="dxa" w:w="0"/>
-                <w:bottom w:type="dxa" w:w="0"/>
-                <w:right w:type="dxa" w:w="0"/>
-              </w:tblCellMar>
-            </w:tblPr>
-            <w:tblGrid>
-              <w:gridCol w:w="7560"/>
-              <w:gridCol w:w="1800"/>
-            </w:tblGrid>
-            <w:tr>
-              <w:tc>
-                <w:tcPr>
-                  <w:tcW w:type="dxa" w:w="7560"/>
-                  <w:tcBorders>
-                    <w:top w:val="single" w:color="CCCCCC" w:sz="1"/>
-                    <w:left w:val="single" w:color="CCCCCC" w:sz="1"/>
-                    <w:bottom w:val="single" w:color="CCCCCC" w:sz="1"/>
-                    <w:right w:val="single" w:color="CCCCCC" w:sz="1"/>
-                  </w:tcBorders>
-                  <w:shd w:fill="FFFFFF" w:val="clear"/>
-                  <w:tcMar>
-                    <w:top w:type="dxa" w:w="80"/>
-                    <w:left w:type="dxa" w:w="120"/>
-                    <w:bottom w:type="dxa" w:w="80"/>
-                    <w:right w:type="dxa" w:w="120"/>
-                  </w:tcMar>
-                  <w:vAlign w:val="top"/>
-                </w:tcPr>
-                <w:p>
-                  <w:pPr>
-                    <w:spacing w:after="20" w:before="0"/>
-                    <w:jc w:val="left"/>
-                  </w:pPr>
-                  <w:r>
-                    <w:rPr>
-                      <w:rFonts w:ascii="Arial" w:cs="Arial" w:eastAsia="Arial" w:hAnsi="Arial"/>
-                      <w:b/>
-                      <w:bCs/>
-                      <w:i w:val="false"/>
-                      <w:iCs w:val="false"/>
-                      <w:color w:val="2E7D32"/>
-                      <w:sz w:val="18"/>
-                      <w:szCs w:val="18"/>
-                    </w:rPr>
-                    <w:t xml:space="preserve">Assignment A3</w:t>
-                  </w:r>
-                  <w:r>
-                    <w:rPr>
-                      <w:rFonts w:ascii="Arial" w:cs="Arial" w:eastAsia="Arial" w:hAnsi="Arial"/>
-                      <w:b w:val="false"/>
-                      <w:bCs w:val="false"/>
-                      <w:i w:val="false"/>
-                      <w:iCs w:val="false"/>
-                      <w:color w:val="666666"/>
-                      <w:sz w:val="18"/>
-                      <w:szCs w:val="18"/>
-                    </w:rPr>
-                    <w:t xml:space="preserve">   |   Module 3   |   CO3</w:t>
-                  </w:r>
-                </w:p>
-                <w:p>
-                  <w:pPr>
-                    <w:spacing w:after="80" w:before="0"/>
-                    <w:jc w:val="left"/>
-                  </w:pPr>
-                  <w:r>
-                    <w:rPr>
-                      <w:rFonts w:ascii="Arial" w:cs="Arial" w:eastAsia="Arial" w:hAnsi="Arial"/>
-                      <w:b/>
-                      <w:bCs/>
-                      <w:i w:val="false"/>
-                      <w:iCs w:val="false"/>
-                      <w:color w:val="111111"/>
-                      <w:sz w:val="24"/>
-                      <w:szCs w:val="24"/>
-                    </w:rPr>
-                    <w:t xml:space="preserve">IoT Communication Protocol Comparative Study</w:t>
-                  </w:r>
-                </w:p>
-              </w:tc>
-              <w:tc>
-                <w:tcPr>
-                  <w:tcW w:type="dxa" w:w="1800"/>
-                  <w:tcBorders>
-                    <w:top w:val="single" w:color="CCCCCC" w:sz="1"/>
-                    <w:left w:val="single" w:color="CCCCCC" w:sz="1"/>
-                    <w:bottom w:val="single" w:color="CCCCCC" w:sz="1"/>
-                    <w:right w:val="single" w:color="CCCCCC" w:sz="1"/>
-                  </w:tcBorders>
-                  <w:shd w:fill="FFFFFF" w:val="clear"/>
-                  <w:tcMar>
-                    <w:top w:type="dxa" w:w="80"/>
-                    <w:left w:type="dxa" w:w="120"/>
-                    <w:bottom w:type="dxa" w:w="80"/>
-                    <w:right w:type="dxa" w:w="120"/>
-                  </w:tcMar>
-                  <w:vAlign w:val="center"/>
-                </w:tcPr>
-                <w:p>
-                  <w:pPr>
-                    <w:spacing w:after="10" w:before="0"/>
-                    <w:jc w:val="left"/>
-                  </w:pPr>
-                  <w:r>
-                    <w:rPr>
-                      <w:rFonts w:ascii="Arial" w:cs="Arial" w:eastAsia="Arial" w:hAnsi="Arial"/>
-                      <w:b w:val="false"/>
-                      <w:bCs w:val="false"/>
-                      <w:i w:val="false"/>
-                      <w:iCs w:val="false"/>
-                      <w:color w:val="888888"/>
-                      <w:sz w:val="18"/>
-                      <w:szCs w:val="18"/>
-                    </w:rPr>
-                    <w:t xml:space="preserve">Marks</w:t>
-                  </w:r>
-                </w:p>
-                <w:p>
-                  <w:pPr>
-                    <w:spacing w:after="80" w:before="0"/>
-                    <w:jc w:val="left"/>
-                  </w:pPr>
-                  <w:r>
-                    <w:rPr>
-                      <w:rFonts w:ascii="Arial" w:cs="Arial" w:eastAsia="Arial" w:hAnsi="Arial"/>
-                      <w:b/>
-                      <w:bCs/>
-                      <w:i w:val="false"/>
-                      <w:iCs w:val="false"/>
-                      <w:color w:val="2E7D32"/>
-                      <w:sz w:val="32"/>
-                      <w:szCs w:val="32"/>
-                    </w:rPr>
-                    <w:t xml:space="preserve">10</w:t>
-                  </w:r>
-                </w:p>
-              </w:tc>
-            </w:tr>
-          </w:tbl>
-          <w:p/>
-        </w:tc>
-      </w:tr>
-      <w:tr>
-        <w:tc>
-          <w:tcPr>
-            <w:tcW w:type="dxa" w:w="9360"/>
-            <w:tcBorders>
-              <w:top w:val="none" w:color="FFFFFF" w:sz="0"/>
-              <w:left w:val="none" w:color="FFFFFF" w:sz="0"/>
-              <w:bottom w:val="none" w:color="FFFFFF" w:sz="0"/>
-              <w:right w:val="none" w:color="FFFFFF" w:sz="0"/>
-            </w:tcBorders>
-            <w:shd w:fill="2E7D32" w:val="clear"/>
-            <w:tcMar>
-              <w:top w:type="dxa" w:w="80"/>
-              <w:left w:type="dxa" w:w="120"/>
-              <w:bottom w:type="dxa" w:w="80"/>
-              <w:right w:type="dxa" w:w="120"/>
-            </w:tcMar>
-            <w:vAlign w:val="top"/>
-          </w:tcPr>
-          <w:p>
-            <w:pPr>
-              <w:spacing w:after="80" w:before="0"/>
-              <w:jc w:val="left"/>
-            </w:pPr>
-            <w:r>
-              <w:rPr>
-                <w:rFonts w:ascii="Arial" w:cs="Arial" w:eastAsia="Arial" w:hAnsi="Arial"/>
-                <w:b w:val="false"/>
-                <w:bCs w:val="false"/>
-                <w:i w:val="false"/>
-                <w:iCs w:val="false"/>
-                <w:color w:val="000000"/>
-                <w:sz w:val="22"/>
-                <w:szCs w:val="22"/>
-              </w:rPr>
-              <w:t xml:space="preserve"/>
-            </w:r>
-          </w:p>
-        </w:tc>
-      </w:tr>
-      <w:tr>
-        <w:tc>
-          <w:tcPr>
-            <w:tcW w:type="dxa" w:w="1800"/>
-            <w:tcBorders>
-              <w:top w:val="single" w:color="CCCCCC" w:sz="1"/>
-              <w:left w:val="single" w:color="CCCCCC" w:sz="1"/>
-              <w:bottom w:val="single" w:color="CCCCCC" w:sz="1"/>
-              <w:right w:val="single" w:color="CCCCCC" w:sz="1"/>
-            </w:tcBorders>
-            <w:shd w:fill="E8F5E9" w:val="clear"/>
-            <w:tcMar>
-              <w:top w:type="dxa" w:w="80"/>
-              <w:left w:type="dxa" w:w="120"/>
-              <w:bottom w:type="dxa" w:w="80"/>
-              <w:right w:type="dxa" w:w="120"/>
-            </w:tcMar>
-            <w:vAlign w:val="top"/>
-          </w:tcPr>
-          <w:p>
-            <w:pPr>
-              <w:spacing w:after="80" w:before="0"/>
-              <w:jc w:val="left"/>
-            </w:pPr>
-            <w:r>
-              <w:rPr>
-                <w:rFonts w:ascii="Arial" w:cs="Arial" w:eastAsia="Arial" w:hAnsi="Arial"/>
-                <w:b/>
-                <w:bCs/>
-                <w:i w:val="false"/>
-                <w:iCs w:val="false"/>
-                <w:color w:val="444444"/>
-                <w:sz w:val="19"/>
-                <w:szCs w:val="19"/>
-              </w:rPr>
-              <w:t xml:space="preserve">Tools</w:t>
-            </w:r>
-          </w:p>
-        </w:tc>
-        <w:tc>
-          <w:tcPr>
-            <w:tcW w:type="dxa" w:w="7560"/>
-            <w:tcBorders>
-              <w:top w:val="single" w:color="CCCCCC" w:sz="1"/>
-              <w:left w:val="single" w:color="CCCCCC" w:sz="1"/>
-              <w:bottom w:val="single" w:color="CCCCCC" w:sz="1"/>
-              <w:right w:val="single" w:color="CCCCCC" w:sz="1"/>
-            </w:tcBorders>
-            <w:shd w:fill="E8F5E9" w:val="clear"/>
-            <w:tcMar>
-              <w:top w:type="dxa" w:w="80"/>
-              <w:left w:type="dxa" w:w="120"/>
-              <w:bottom w:type="dxa" w:w="80"/>
-              <w:right w:type="dxa" w:w="120"/>
-            </w:tcMar>
-            <w:vAlign w:val="top"/>
-          </w:tcPr>
-          <w:p>
-            <w:pPr>
-              <w:spacing w:after="80" w:before="0"/>
-              <w:jc w:val="left"/>
-            </w:pPr>
-            <w:r>
-              <w:rPr>
-                <w:rFonts w:ascii="Arial" w:cs="Arial" w:eastAsia="Arial" w:hAnsi="Arial"/>
-                <w:b w:val="false"/>
-                <w:bCs w:val="false"/>
-                <w:i w:val="false"/>
-                <w:iCs w:val="false"/>
-                <w:color w:val="000000"/>
-                <w:sz w:val="19"/>
-                <w:szCs w:val="19"/>
-              </w:rPr>
-              <w:t xml:space="preserve">TB2 (Cisco Press), REF2 (Al-Fuqaha et al. IEEE Survey), internet</w:t>
-            </w:r>
-          </w:p>
-        </w:tc>
-      </w:tr>
-      <w:tr>
-        <w:tc>
-          <w:tcPr>
-            <w:tcW w:type="dxa" w:w="1800"/>
-            <w:tcBorders>
-              <w:top w:val="single" w:color="CCCCCC" w:sz="1"/>
-              <w:left w:val="single" w:color="CCCCCC" w:sz="1"/>
-              <w:bottom w:val="single" w:color="CCCCCC" w:sz="1"/>
-              <w:right w:val="single" w:color="CCCCCC" w:sz="1"/>
-            </w:tcBorders>
-            <w:shd w:fill="E8F5E9" w:val="clear"/>
-            <w:tcMar>
-              <w:top w:type="dxa" w:w="80"/>
-              <w:left w:type="dxa" w:w="120"/>
-              <w:bottom w:type="dxa" w:w="80"/>
-              <w:right w:type="dxa" w:w="120"/>
-            </w:tcMar>
-            <w:vAlign w:val="top"/>
-          </w:tcPr>
-          <w:p>
-            <w:pPr>
-              <w:spacing w:after="80" w:before="0"/>
-              <w:jc w:val="left"/>
-            </w:pPr>
-            <w:r>
-              <w:rPr>
-                <w:rFonts w:ascii="Arial" w:cs="Arial" w:eastAsia="Arial" w:hAnsi="Arial"/>
-                <w:b/>
-                <w:bCs/>
-                <w:i w:val="false"/>
-                <w:iCs w:val="false"/>
-                <w:color w:val="444444"/>
-                <w:sz w:val="19"/>
-                <w:szCs w:val="19"/>
-              </w:rPr>
-              <w:t xml:space="preserve">Description</w:t>
-            </w:r>
-          </w:p>
-        </w:tc>
-        <w:tc>
-          <w:tcPr>
-            <w:tcW w:type="dxa" w:w="7560"/>
-            <w:tcBorders>
-              <w:top w:val="single" w:color="CCCCCC" w:sz="1"/>
-              <w:left w:val="single" w:color="CCCCCC" w:sz="1"/>
-              <w:bottom w:val="single" w:color="CCCCCC" w:sz="1"/>
-              <w:right w:val="single" w:color="CCCCCC" w:sz="1"/>
-            </w:tcBorders>
-            <w:shd w:fill="E8F5E9" w:val="clear"/>
-            <w:tcMar>
-              <w:top w:type="dxa" w:w="80"/>
-              <w:left w:type="dxa" w:w="120"/>
-              <w:bottom w:type="dxa" w:w="80"/>
-              <w:right w:type="dxa" w:w="120"/>
-            </w:tcMar>
-            <w:vAlign w:val="top"/>
-          </w:tcPr>
-          <w:p>
-            <w:pPr>
-              <w:spacing w:after="80" w:before="0"/>
-              <w:jc w:val="left"/>
-            </w:pPr>
-            <w:r>
-              <w:rPr>
-                <w:rFonts w:ascii="Arial" w:cs="Arial" w:eastAsia="Arial" w:hAnsi="Arial"/>
-                <w:b w:val="false"/>
-                <w:bCs w:val="false"/>
-                <w:i w:val="false"/>
-                <w:iCs w:val="false"/>
-                <w:color w:val="000000"/>
-                <w:sz w:val="19"/>
-                <w:szCs w:val="19"/>
-              </w:rPr>
-              <w:t xml:space="preserve">Conduct a comparative study of the following IoT communication protocols covered in Module 3: ZigBee, LoRaWAN, LTE-M, NB-IoT, and IEEE 802.15.4. Compare them across technical parameters and real-world suitability. Include at least ONE real deployment case study for any two protocols.</w:t>
-            </w:r>
-          </w:p>
-        </w:tc>
-      </w:tr>
-      <w:tr>
-        <w:tc>
-          <w:tcPr>
-            <w:tcW w:type="dxa" w:w="1800"/>
-            <w:tcBorders>
-              <w:top w:val="single" w:color="CCCCCC" w:sz="1"/>
-              <w:left w:val="single" w:color="CCCCCC" w:sz="1"/>
-              <w:bottom w:val="single" w:color="CCCCCC" w:sz="1"/>
-              <w:right w:val="single" w:color="CCCCCC" w:sz="1"/>
-            </w:tcBorders>
-            <w:shd w:fill="E8F5E9" w:val="clear"/>
-            <w:tcMar>
-              <w:top w:type="dxa" w:w="80"/>
-              <w:left w:type="dxa" w:w="120"/>
-              <w:bottom w:type="dxa" w:w="80"/>
-              <w:right w:type="dxa" w:w="120"/>
-            </w:tcMar>
-            <w:vAlign w:val="top"/>
-          </w:tcPr>
-          <w:p>
-            <w:pPr>
-              <w:spacing w:after="80" w:before="0"/>
-              <w:jc w:val="left"/>
-            </w:pPr>
-            <w:r>
-              <w:rPr>
-                <w:rFonts w:ascii="Arial" w:cs="Arial" w:eastAsia="Arial" w:hAnsi="Arial"/>
-                <w:b/>
-                <w:bCs/>
-                <w:i w:val="false"/>
-                <w:iCs w:val="false"/>
-                <w:color w:val="444444"/>
-                <w:sz w:val="19"/>
-                <w:szCs w:val="19"/>
-              </w:rPr>
-              <w:t xml:space="preserve">Deliverables</w:t>
-            </w:r>
-          </w:p>
-        </w:tc>
-        <w:tc>
-          <w:tcPr>
-            <w:tcW w:type="dxa" w:w="7560"/>
-            <w:tcBorders>
-              <w:top w:val="single" w:color="CCCCCC" w:sz="1"/>
-              <w:left w:val="single" w:color="CCCCCC" w:sz="1"/>
-              <w:bottom w:val="single" w:color="CCCCCC" w:sz="1"/>
-              <w:right w:val="single" w:color="CCCCCC" w:sz="1"/>
-            </w:tcBorders>
-            <w:shd w:fill="E8F5E9" w:val="clear"/>
-            <w:tcMar>
-              <w:top w:type="dxa" w:w="80"/>
-              <w:left w:type="dxa" w:w="120"/>
-              <w:bottom w:type="dxa" w:w="80"/>
-              <w:right w:type="dxa" w:w="120"/>
-            </w:tcMar>
-            <w:vAlign w:val="top"/>
-          </w:tcPr>
-          <w:p>
-            <w:pPr>
-              <w:spacing w:after="30" w:before="0"/>
-              <w:jc w:val="left"/>
-            </w:pPr>
-            <w:r>
-              <w:rPr>
-                <w:rFonts w:ascii="Arial" w:cs="Arial" w:eastAsia="Arial" w:hAnsi="Arial"/>
-                <w:b w:val="false"/>
-                <w:bCs w:val="false"/>
-                <w:i w:val="false"/>
-                <w:iCs w:val="false"/>
-                <w:color w:val="000000"/>
-                <w:sz w:val="19"/>
-                <w:szCs w:val="19"/>
-              </w:rPr>
-              <w:t xml:space="preserve">• Introduction to the need for multiple IoT protocols (0.5 page)</w:t>
-            </w:r>
-          </w:p>
-          <w:p>
-            <w:pPr>
-              <w:spacing w:after="30" w:before="0"/>
-              <w:jc w:val="left"/>
-            </w:pPr>
-            <w:r>
-              <w:rPr>
-                <w:rFonts w:ascii="Arial" w:cs="Arial" w:eastAsia="Arial" w:hAnsi="Arial"/>
-                <w:b w:val="false"/>
-                <w:bCs w:val="false"/>
-                <w:i w:val="false"/>
-                <w:iCs w:val="false"/>
-                <w:color w:val="000000"/>
-                <w:sz w:val="19"/>
-                <w:szCs w:val="19"/>
-              </w:rPr>
-              <w:t xml:space="preserve">• Individual protocol descriptions — architecture, frequency, range, data rate, power (2 pages)</w:t>
-            </w:r>
-          </w:p>
-          <w:p>
-            <w:pPr>
-              <w:spacing w:after="30" w:before="0"/>
-              <w:jc w:val="left"/>
-            </w:pPr>
-            <w:r>
-              <w:rPr>
-                <w:rFonts w:ascii="Arial" w:cs="Arial" w:eastAsia="Arial" w:hAnsi="Arial"/>
-                <w:b w:val="false"/>
-                <w:bCs w:val="false"/>
-                <w:i w:val="false"/>
-                <w:iCs w:val="false"/>
-                <w:color w:val="000000"/>
-                <w:sz w:val="19"/>
-                <w:szCs w:val="19"/>
-              </w:rPr>
-              <w:t xml:space="preserve">• Comparison table: Protocol | Frequency | Range | Data Rate | Power | Topology | Cost | Use Case</w:t>
-            </w:r>
-          </w:p>
-          <w:p>
-            <w:pPr>
-              <w:spacing w:after="30" w:before="0"/>
-              <w:jc w:val="left"/>
-            </w:pPr>
-            <w:r>
-              <w:rPr>
-                <w:rFonts w:ascii="Arial" w:cs="Arial" w:eastAsia="Arial" w:hAnsi="Arial"/>
-                <w:b w:val="false"/>
-                <w:bCs w:val="false"/>
-                <w:i w:val="false"/>
-                <w:iCs w:val="false"/>
-                <w:color w:val="000000"/>
-                <w:sz w:val="19"/>
-                <w:szCs w:val="19"/>
-              </w:rPr>
-              <w:t xml:space="preserve">• Case study 1: A real deployment using ZigBee or LoRaWAN (1 page)</w:t>
-            </w:r>
-          </w:p>
-          <w:p>
-            <w:pPr>
-              <w:spacing w:after="30" w:before="0"/>
-              <w:jc w:val="left"/>
-            </w:pPr>
-            <w:r>
-              <w:rPr>
-                <w:rFonts w:ascii="Arial" w:cs="Arial" w:eastAsia="Arial" w:hAnsi="Arial"/>
-                <w:b w:val="false"/>
-                <w:bCs w:val="false"/>
-                <w:i w:val="false"/>
-                <w:iCs w:val="false"/>
-                <w:color w:val="000000"/>
-                <w:sz w:val="19"/>
-                <w:szCs w:val="19"/>
-              </w:rPr>
-              <w:t xml:space="preserve">• Case study 2: A real deployment using LTE-M or NB-IoT (1 page)</w:t>
-            </w:r>
-          </w:p>
-          <w:p>
-            <w:pPr>
-              <w:spacing w:after="30" w:before="0"/>
-              <w:jc w:val="left"/>
-            </w:pPr>
-            <w:r>
-              <w:rPr>
-                <w:rFonts w:ascii="Arial" w:cs="Arial" w:eastAsia="Arial" w:hAnsi="Arial"/>
-                <w:b w:val="false"/>
-                <w:bCs w:val="false"/>
-                <w:i w:val="false"/>
-                <w:iCs w:val="false"/>
-                <w:color w:val="000000"/>
-                <w:sz w:val="19"/>
-                <w:szCs w:val="19"/>
-              </w:rPr>
-              <w:t xml:space="preserve">• Recommendation: which protocol to choose for (a) smart agriculture, (b) smart city, (c) factory automation — justify</w:t>
-            </w:r>
-          </w:p>
-          <w:p>
-            <w:pPr>
-              <w:spacing w:after="30" w:before="0"/>
-              <w:jc w:val="left"/>
-            </w:pPr>
-            <w:r>
-              <w:rPr>
-                <w:rFonts w:ascii="Arial" w:cs="Arial" w:eastAsia="Arial" w:hAnsi="Arial"/>
-                <w:b w:val="false"/>
-                <w:bCs w:val="false"/>
-                <w:i w:val="false"/>
-                <w:iCs w:val="false"/>
-                <w:color w:val="000000"/>
-                <w:sz w:val="19"/>
-                <w:szCs w:val="19"/>
-              </w:rPr>
-              <w:t xml:space="preserve">• References</w:t>
-            </w:r>
-          </w:p>
-        </w:tc>
-      </w:tr>
-    </w:tbl>
-    <w:p>
-      <w:pPr>
-        <w:spacing w:after="80" w:before="0"/>
-        <w:jc w:val="left"/>
-      </w:pPr>
-      <w:r>
-        <w:rPr>
-          <w:rFonts w:ascii="Arial" w:cs="Arial" w:eastAsia="Arial" w:hAnsi="Arial"/>
-          <w:b w:val="false"/>
-          <w:bCs w:val="false"/>
-          <w:i w:val="false"/>
-          <w:iCs w:val="false"/>
-          <w:color w:val="000000"/>
-          <w:sz w:val="22"/>
-          <w:szCs w:val="22"/>
-        </w:rPr>
-        <w:t xml:space="preserve"/>
-      </w:r>
-    </w:p>
-    <w:tbl>
-      <w:tblPr>
-        <w:tblW w:type="dxa" w:w="9360"/>
-        <w:tblBorders>
-          <w:top w:val="single" w:color="auto" w:sz="4"/>
-          <w:left w:val="single" w:color="auto" w:sz="4"/>
-          <w:bottom w:val="single" w:color="auto" w:sz="4"/>
-          <w:right w:val="single" w:color="auto" w:sz="4"/>
-          <w:insideH w:val="single" w:color="auto" w:sz="4"/>
-          <w:insideV w:val="single" w:color="auto" w:sz="4"/>
-        </w:tblBorders>
-      </w:tblPr>
-      <w:tblGrid>
-        <w:gridCol w:w="9360"/>
-      </w:tblGrid>
-      <w:tr>
-        <w:tc>
-          <w:tcPr>
-            <w:tcW w:type="dxa" w:w="9360"/>
-            <w:tcBorders>
-              <w:top w:val="single" w:color="CCCCCC" w:sz="1"/>
-              <w:left w:val="single" w:color="CCCCCC" w:sz="1"/>
-              <w:bottom w:val="single" w:color="CCCCCC" w:sz="1"/>
-              <w:right w:val="single" w:color="CCCCCC" w:sz="1"/>
-            </w:tcBorders>
-            <w:shd w:fill="FFFFFF" w:val="clear"/>
-            <w:tcMar>
-              <w:top w:type="dxa" w:w="80"/>
-              <w:left w:type="dxa" w:w="120"/>
-              <w:bottom w:type="dxa" w:w="80"/>
-              <w:right w:type="dxa" w:w="120"/>
-            </w:tcMar>
-            <w:vAlign w:val="top"/>
-          </w:tcPr>
-          <w:tbl>
-            <w:tblPr>
-              <w:tblW w:type="dxa" w:w="9260"/>
-              <w:tblBorders>
-                <w:top w:val="single" w:color="auto" w:sz="4"/>
-                <w:left w:val="single" w:color="auto" w:sz="4"/>
-                <w:bottom w:val="single" w:color="auto" w:sz="4"/>
-                <w:right w:val="single" w:color="auto" w:sz="4"/>
-                <w:insideH w:val="single" w:color="auto" w:sz="4"/>
-                <w:insideV w:val="single" w:color="auto" w:sz="4"/>
-              </w:tblBorders>
-              <w:tblCellMar>
-                <w:top w:type="dxa" w:w="0"/>
-                <w:left w:type="dxa" w:w="0"/>
-                <w:bottom w:type="dxa" w:w="0"/>
-                <w:right w:type="dxa" w:w="0"/>
-              </w:tblCellMar>
-            </w:tblPr>
-            <w:tblGrid>
-              <w:gridCol w:w="7560"/>
-              <w:gridCol w:w="1800"/>
-            </w:tblGrid>
-            <w:tr>
-              <w:tc>
-                <w:tcPr>
-                  <w:tcW w:type="dxa" w:w="7560"/>
-                  <w:tcBorders>
-                    <w:top w:val="single" w:color="CCCCCC" w:sz="1"/>
-                    <w:left w:val="single" w:color="CCCCCC" w:sz="1"/>
-                    <w:bottom w:val="single" w:color="CCCCCC" w:sz="1"/>
-                    <w:right w:val="single" w:color="CCCCCC" w:sz="1"/>
-                  </w:tcBorders>
-                  <w:shd w:fill="FFFFFF" w:val="clear"/>
-                  <w:tcMar>
-                    <w:top w:type="dxa" w:w="80"/>
-                    <w:left w:type="dxa" w:w="120"/>
-                    <w:bottom w:type="dxa" w:w="80"/>
-                    <w:right w:type="dxa" w:w="120"/>
-                  </w:tcMar>
-                  <w:vAlign w:val="top"/>
-                </w:tcPr>
-                <w:p>
-                  <w:pPr>
-                    <w:spacing w:after="20" w:before="0"/>
-                    <w:jc w:val="left"/>
-                  </w:pPr>
-                  <w:r>
-                    <w:rPr>
-                      <w:rFonts w:ascii="Arial" w:cs="Arial" w:eastAsia="Arial" w:hAnsi="Arial"/>
-                      <w:b/>
-                      <w:bCs/>
-                      <w:i w:val="false"/>
-                      <w:iCs w:val="false"/>
-                      <w:color w:val="2E7D32"/>
-                      <w:sz w:val="18"/>
-                      <w:szCs w:val="18"/>
-                    </w:rPr>
-                    <w:t xml:space="preserve">Assignment A4</w:t>
-                  </w:r>
-                  <w:r>
-                    <w:rPr>
-                      <w:rFonts w:ascii="Arial" w:cs="Arial" w:eastAsia="Arial" w:hAnsi="Arial"/>
-                      <w:b w:val="false"/>
-                      <w:bCs w:val="false"/>
-                      <w:i w:val="false"/>
-                      <w:iCs w:val="false"/>
-                      <w:color w:val="666666"/>
-                      <w:sz w:val="18"/>
-                      <w:szCs w:val="18"/>
-                    </w:rPr>
-                    <w:t xml:space="preserve">   |   Module 4   |   CO4</w:t>
-                  </w:r>
-                </w:p>
-                <w:p>
-                  <w:pPr>
-                    <w:spacing w:after="80" w:before="0"/>
-                    <w:jc w:val="left"/>
-                  </w:pPr>
-                  <w:r>
-                    <w:rPr>
-                      <w:rFonts w:ascii="Arial" w:cs="Arial" w:eastAsia="Arial" w:hAnsi="Arial"/>
-                      <w:b/>
-                      <w:bCs/>
-                      <w:i w:val="false"/>
-                      <w:iCs w:val="false"/>
-                      <w:color w:val="111111"/>
-                      <w:sz w:val="24"/>
-                      <w:szCs w:val="24"/>
-                    </w:rPr>
-                    <w:t xml:space="preserve">IoT Security Threat Analysis using the Layered Attacker Model</w:t>
-                  </w:r>
-                </w:p>
-              </w:tc>
-              <w:tc>
-                <w:tcPr>
-                  <w:tcW w:type="dxa" w:w="1800"/>
-                  <w:tcBorders>
-                    <w:top w:val="single" w:color="CCCCCC" w:sz="1"/>
-                    <w:left w:val="single" w:color="CCCCCC" w:sz="1"/>
-                    <w:bottom w:val="single" w:color="CCCCCC" w:sz="1"/>
-                    <w:right w:val="single" w:color="CCCCCC" w:sz="1"/>
-                  </w:tcBorders>
-                  <w:shd w:fill="FFFFFF" w:val="clear"/>
-                  <w:tcMar>
-                    <w:top w:type="dxa" w:w="80"/>
-                    <w:left w:type="dxa" w:w="120"/>
-                    <w:bottom w:type="dxa" w:w="80"/>
-                    <w:right w:type="dxa" w:w="120"/>
-                  </w:tcMar>
-                  <w:vAlign w:val="center"/>
-                </w:tcPr>
-                <w:p>
-                  <w:pPr>
-                    <w:spacing w:after="10" w:before="0"/>
-                    <w:jc w:val="left"/>
-                  </w:pPr>
-                  <w:r>
-                    <w:rPr>
-                      <w:rFonts w:ascii="Arial" w:cs="Arial" w:eastAsia="Arial" w:hAnsi="Arial"/>
-                      <w:b w:val="false"/>
-                      <w:bCs w:val="false"/>
-                      <w:i w:val="false"/>
-                      <w:iCs w:val="false"/>
-                      <w:color w:val="888888"/>
-                      <w:sz w:val="18"/>
-                      <w:szCs w:val="18"/>
-                    </w:rPr>
-                    <w:t xml:space="preserve">Marks</w:t>
-                  </w:r>
-                </w:p>
-                <w:p>
-                  <w:pPr>
-                    <w:spacing w:after="80" w:before="0"/>
-                    <w:jc w:val="left"/>
-                  </w:pPr>
-                  <w:r>
-                    <w:rPr>
-                      <w:rFonts w:ascii="Arial" w:cs="Arial" w:eastAsia="Arial" w:hAnsi="Arial"/>
-                      <w:b/>
-                      <w:bCs/>
-                      <w:i w:val="false"/>
-                      <w:iCs w:val="false"/>
-                      <w:color w:val="2E7D32"/>
-                      <w:sz w:val="32"/>
-                      <w:szCs w:val="32"/>
-                    </w:rPr>
-                    <w:t xml:space="preserve">10</w:t>
-                  </w:r>
-                </w:p>
-              </w:tc>
-            </w:tr>
-          </w:tbl>
-          <w:p/>
-        </w:tc>
-      </w:tr>
-      <w:tr>
-        <w:tc>
-          <w:tcPr>
-            <w:tcW w:type="dxa" w:w="9360"/>
-            <w:tcBorders>
-              <w:top w:val="none" w:color="FFFFFF" w:sz="0"/>
-              <w:left w:val="none" w:color="FFFFFF" w:sz="0"/>
-              <w:bottom w:val="none" w:color="FFFFFF" w:sz="0"/>
-              <w:right w:val="none" w:color="FFFFFF" w:sz="0"/>
-            </w:tcBorders>
-            <w:shd w:fill="2E7D32" w:val="clear"/>
-            <w:tcMar>
-              <w:top w:type="dxa" w:w="80"/>
-              <w:left w:type="dxa" w:w="120"/>
-              <w:bottom w:type="dxa" w:w="80"/>
-              <w:right w:type="dxa" w:w="120"/>
-            </w:tcMar>
-            <w:vAlign w:val="top"/>
-          </w:tcPr>
-          <w:p>
-            <w:pPr>
-              <w:spacing w:after="80" w:before="0"/>
-              <w:jc w:val="left"/>
-            </w:pPr>
-            <w:r>
-              <w:rPr>
-                <w:rFonts w:ascii="Arial" w:cs="Arial" w:eastAsia="Arial" w:hAnsi="Arial"/>
-                <w:b w:val="false"/>
-                <w:bCs w:val="false"/>
-                <w:i w:val="false"/>
-                <w:iCs w:val="false"/>
-                <w:color w:val="000000"/>
-                <w:sz w:val="22"/>
-                <w:szCs w:val="22"/>
-              </w:rPr>
-              <w:t xml:space="preserve"/>
-            </w:r>
-          </w:p>
-        </w:tc>
-      </w:tr>
-      <w:tr>
-        <w:tc>
-          <w:tcPr>
-            <w:tcW w:type="dxa" w:w="1800"/>
-            <w:tcBorders>
-              <w:top w:val="single" w:color="CCCCCC" w:sz="1"/>
-              <w:left w:val="single" w:color="CCCCCC" w:sz="1"/>
-              <w:bottom w:val="single" w:color="CCCCCC" w:sz="1"/>
-              <w:right w:val="single" w:color="CCCCCC" w:sz="1"/>
-            </w:tcBorders>
-            <w:shd w:fill="E8F5E9" w:val="clear"/>
-            <w:tcMar>
-              <w:top w:type="dxa" w:w="80"/>
-              <w:left w:type="dxa" w:w="120"/>
-              <w:bottom w:type="dxa" w:w="80"/>
-              <w:right w:type="dxa" w:w="120"/>
-            </w:tcMar>
-            <w:vAlign w:val="top"/>
-          </w:tcPr>
-          <w:p>
-            <w:pPr>
-              <w:spacing w:after="80" w:before="0"/>
-              <w:jc w:val="left"/>
-            </w:pPr>
-            <w:r>
-              <w:rPr>
-                <w:rFonts w:ascii="Arial" w:cs="Arial" w:eastAsia="Arial" w:hAnsi="Arial"/>
-                <w:b/>
-                <w:bCs/>
-                <w:i w:val="false"/>
-                <w:iCs w:val="false"/>
-                <w:color w:val="444444"/>
-                <w:sz w:val="19"/>
-                <w:szCs w:val="19"/>
-              </w:rPr>
-              <w:t xml:space="preserve">Tools</w:t>
-            </w:r>
-          </w:p>
-        </w:tc>
-        <w:tc>
-          <w:tcPr>
-            <w:tcW w:type="dxa" w:w="7560"/>
-            <w:tcBorders>
-              <w:top w:val="single" w:color="CCCCCC" w:sz="1"/>
-              <w:left w:val="single" w:color="CCCCCC" w:sz="1"/>
-              <w:bottom w:val="single" w:color="CCCCCC" w:sz="1"/>
-              <w:right w:val="single" w:color="CCCCCC" w:sz="1"/>
-            </w:tcBorders>
-            <w:shd w:fill="E8F5E9" w:val="clear"/>
-            <w:tcMar>
-              <w:top w:type="dxa" w:w="80"/>
-              <w:left w:type="dxa" w:w="120"/>
-              <w:bottom w:type="dxa" w:w="80"/>
-              <w:right w:type="dxa" w:w="120"/>
-            </w:tcMar>
-            <w:vAlign w:val="top"/>
-          </w:tcPr>
-          <w:p>
-            <w:pPr>
-              <w:spacing w:after="80" w:before="0"/>
-              <w:jc w:val="left"/>
-            </w:pPr>
-            <w:r>
-              <w:rPr>
-                <w:rFonts w:ascii="Arial" w:cs="Arial" w:eastAsia="Arial" w:hAnsi="Arial"/>
-                <w:b w:val="false"/>
-                <w:bCs w:val="false"/>
-                <w:i w:val="false"/>
-                <w:iCs w:val="false"/>
-                <w:color w:val="000000"/>
-                <w:sz w:val="19"/>
-                <w:szCs w:val="19"/>
-              </w:rPr>
-              <w:t xml:space="preserve">TB2 (Cisco Press), Module 4 notes, internet (CVE databases, news)</w:t>
-            </w:r>
-          </w:p>
-        </w:tc>
-      </w:tr>
-      <w:tr>
-        <w:tc>
-          <w:tcPr>
-            <w:tcW w:type="dxa" w:w="1800"/>
-            <w:tcBorders>
-              <w:top w:val="single" w:color="CCCCCC" w:sz="1"/>
-              <w:left w:val="single" w:color="CCCCCC" w:sz="1"/>
-              <w:bottom w:val="single" w:color="CCCCCC" w:sz="1"/>
-              <w:right w:val="single" w:color="CCCCCC" w:sz="1"/>
-            </w:tcBorders>
-            <w:shd w:fill="E8F5E9" w:val="clear"/>
-            <w:tcMar>
-              <w:top w:type="dxa" w:w="80"/>
-              <w:left w:type="dxa" w:w="120"/>
-              <w:bottom w:type="dxa" w:w="80"/>
-              <w:right w:type="dxa" w:w="120"/>
-            </w:tcMar>
-            <w:vAlign w:val="top"/>
-          </w:tcPr>
-          <w:p>
-            <w:pPr>
-              <w:spacing w:after="80" w:before="0"/>
-              <w:jc w:val="left"/>
-            </w:pPr>
-            <w:r>
-              <w:rPr>
-                <w:rFonts w:ascii="Arial" w:cs="Arial" w:eastAsia="Arial" w:hAnsi="Arial"/>
-                <w:b/>
-                <w:bCs/>
-                <w:i w:val="false"/>
-                <w:iCs w:val="false"/>
-                <w:color w:val="444444"/>
-                <w:sz w:val="19"/>
-                <w:szCs w:val="19"/>
-              </w:rPr>
-              <w:t xml:space="preserve">Description</w:t>
-            </w:r>
-          </w:p>
-        </w:tc>
-        <w:tc>
-          <w:tcPr>
-            <w:tcW w:type="dxa" w:w="7560"/>
-            <w:tcBorders>
-              <w:top w:val="single" w:color="CCCCCC" w:sz="1"/>
-              <w:left w:val="single" w:color="CCCCCC" w:sz="1"/>
-              <w:bottom w:val="single" w:color="CCCCCC" w:sz="1"/>
-              <w:right w:val="single" w:color="CCCCCC" w:sz="1"/>
-            </w:tcBorders>
-            <w:shd w:fill="E8F5E9" w:val="clear"/>
-            <w:tcMar>
-              <w:top w:type="dxa" w:w="80"/>
-              <w:left w:type="dxa" w:w="120"/>
-              <w:bottom w:type="dxa" w:w="80"/>
-              <w:right w:type="dxa" w:w="120"/>
-            </w:tcMar>
-            <w:vAlign w:val="top"/>
-          </w:tcPr>
-          <w:p>
-            <w:pPr>
-              <w:spacing w:after="80" w:before="0"/>
-              <w:jc w:val="left"/>
-            </w:pPr>
-            <w:r>
-              <w:rPr>
-                <w:rFonts w:ascii="Arial" w:cs="Arial" w:eastAsia="Arial" w:hAnsi="Arial"/>
-                <w:b w:val="false"/>
-                <w:bCs w:val="false"/>
-                <w:i w:val="false"/>
-                <w:iCs w:val="false"/>
-                <w:color w:val="000000"/>
-                <w:sz w:val="19"/>
-                <w:szCs w:val="19"/>
-              </w:rPr>
-              <w:t xml:space="preserve">Research ONE real-world IoT security attack from the list below. Using the Layered Attacker Model and Security Requirements studied in Module 4, analyse: how the attack occurred, which layer was compromised, what security controls were missing, and how it could be prevented. Attacks: Mirai Botnet (2016) / Philips Hue Bridge vulnerability / Ring Doorbell credential attack / Stuxnet worm / Verkada security camera breach.</w:t>
-            </w:r>
-          </w:p>
-        </w:tc>
-      </w:tr>
-      <w:tr>
-        <w:tc>
-          <w:tcPr>
-            <w:tcW w:type="dxa" w:w="1800"/>
-            <w:tcBorders>
-              <w:top w:val="single" w:color="CCCCCC" w:sz="1"/>
-              <w:left w:val="single" w:color="CCCCCC" w:sz="1"/>
-              <w:bottom w:val="single" w:color="CCCCCC" w:sz="1"/>
-              <w:right w:val="single" w:color="CCCCCC" w:sz="1"/>
-            </w:tcBorders>
-            <w:shd w:fill="E8F5E9" w:val="clear"/>
-            <w:tcMar>
-              <w:top w:type="dxa" w:w="80"/>
-              <w:left w:type="dxa" w:w="120"/>
-              <w:bottom w:type="dxa" w:w="80"/>
-              <w:right w:type="dxa" w:w="120"/>
-            </w:tcMar>
-            <w:vAlign w:val="top"/>
-          </w:tcPr>
-          <w:p>
-            <w:pPr>
-              <w:spacing w:after="80" w:before="0"/>
-              <w:jc w:val="left"/>
-            </w:pPr>
-            <w:r>
-              <w:rPr>
-                <w:rFonts w:ascii="Arial" w:cs="Arial" w:eastAsia="Arial" w:hAnsi="Arial"/>
-                <w:b/>
-                <w:bCs/>
-                <w:i w:val="false"/>
-                <w:iCs w:val="false"/>
-                <w:color w:val="444444"/>
-                <w:sz w:val="19"/>
-                <w:szCs w:val="19"/>
-              </w:rPr>
-              <w:t xml:space="preserve">Deliverables</w:t>
-            </w:r>
-          </w:p>
-        </w:tc>
-        <w:tc>
-          <w:tcPr>
-            <w:tcW w:type="dxa" w:w="7560"/>
-            <w:tcBorders>
-              <w:top w:val="single" w:color="CCCCCC" w:sz="1"/>
-              <w:left w:val="single" w:color="CCCCCC" w:sz="1"/>
-              <w:bottom w:val="single" w:color="CCCCCC" w:sz="1"/>
-              <w:right w:val="single" w:color="CCCCCC" w:sz="1"/>
-            </w:tcBorders>
-            <w:shd w:fill="E8F5E9" w:val="clear"/>
-            <w:tcMar>
-              <w:top w:type="dxa" w:w="80"/>
-              <w:left w:type="dxa" w:w="120"/>
-              <w:bottom w:type="dxa" w:w="80"/>
-              <w:right w:type="dxa" w:w="120"/>
-            </w:tcMar>
-            <w:vAlign w:val="top"/>
-          </w:tcPr>
-          <w:p>
-            <w:pPr>
-              <w:spacing w:after="30" w:before="0"/>
-              <w:jc w:val="left"/>
-            </w:pPr>
-            <w:r>
-              <w:rPr>
-                <w:rFonts w:ascii="Arial" w:cs="Arial" w:eastAsia="Arial" w:hAnsi="Arial"/>
-                <w:b w:val="false"/>
-                <w:bCs w:val="false"/>
-                <w:i w:val="false"/>
-                <w:iCs w:val="false"/>
-                <w:color w:val="000000"/>
-                <w:sz w:val="19"/>
-                <w:szCs w:val="19"/>
-              </w:rPr>
-              <w:t xml:space="preserve">• Attack summary: what happened, timeline, impact (1 page)</w:t>
-            </w:r>
-          </w:p>
-          <w:p>
-            <w:pPr>
-              <w:spacing w:after="30" w:before="0"/>
-              <w:jc w:val="left"/>
-            </w:pPr>
-            <w:r>
-              <w:rPr>
-                <w:rFonts w:ascii="Arial" w:cs="Arial" w:eastAsia="Arial" w:hAnsi="Arial"/>
-                <w:b w:val="false"/>
-                <w:bCs w:val="false"/>
-                <w:i w:val="false"/>
-                <w:iCs w:val="false"/>
-                <w:color w:val="000000"/>
-                <w:sz w:val="19"/>
-                <w:szCs w:val="19"/>
-              </w:rPr>
-              <w:t xml:space="preserve">• Layered attacker model mapping: which attacker layer launched the attack (1 page)</w:t>
-            </w:r>
-          </w:p>
-          <w:p>
-            <w:pPr>
-              <w:spacing w:after="30" w:before="0"/>
-              <w:jc w:val="left"/>
-            </w:pPr>
-            <w:r>
-              <w:rPr>
-                <w:rFonts w:ascii="Arial" w:cs="Arial" w:eastAsia="Arial" w:hAnsi="Arial"/>
-                <w:b w:val="false"/>
-                <w:bCs w:val="false"/>
-                <w:i w:val="false"/>
-                <w:iCs w:val="false"/>
-                <w:color w:val="000000"/>
-                <w:sz w:val="19"/>
-                <w:szCs w:val="19"/>
-              </w:rPr>
-              <w:t xml:space="preserve">• Security requirements violated: Identify from the syllabus list which requirements failed (0.5 page)</w:t>
-            </w:r>
-          </w:p>
-          <w:p>
-            <w:pPr>
-              <w:spacing w:after="30" w:before="0"/>
-              <w:jc w:val="left"/>
-            </w:pPr>
-            <w:r>
-              <w:rPr>
-                <w:rFonts w:ascii="Arial" w:cs="Arial" w:eastAsia="Arial" w:hAnsi="Arial"/>
-                <w:b w:val="false"/>
-                <w:bCs w:val="false"/>
-                <w:i w:val="false"/>
-                <w:iCs w:val="false"/>
-                <w:color w:val="000000"/>
-                <w:sz w:val="19"/>
-                <w:szCs w:val="19"/>
-              </w:rPr>
-              <w:t xml:space="preserve">• Threat analysis using security tomography — network path of the attack (1 page)</w:t>
-            </w:r>
-          </w:p>
-          <w:p>
-            <w:pPr>
-              <w:spacing w:after="30" w:before="0"/>
-              <w:jc w:val="left"/>
-            </w:pPr>
-            <w:r>
-              <w:rPr>
-                <w:rFonts w:ascii="Arial" w:cs="Arial" w:eastAsia="Arial" w:hAnsi="Arial"/>
-                <w:b w:val="false"/>
-                <w:bCs w:val="false"/>
-                <w:i w:val="false"/>
-                <w:iCs w:val="false"/>
-                <w:color w:val="000000"/>
-                <w:sz w:val="19"/>
-                <w:szCs w:val="19"/>
-              </w:rPr>
-              <w:t xml:space="preserve">• Countermeasures: Identity management, Access control, Secure message communication solutions (1 page)</w:t>
-            </w:r>
-          </w:p>
-          <w:p>
-            <w:pPr>
-              <w:spacing w:after="30" w:before="0"/>
-              <w:jc w:val="left"/>
-            </w:pPr>
-            <w:r>
-              <w:rPr>
-                <w:rFonts w:ascii="Arial" w:cs="Arial" w:eastAsia="Arial" w:hAnsi="Arial"/>
-                <w:b w:val="false"/>
-                <w:bCs w:val="false"/>
-                <w:i w:val="false"/>
-                <w:iCs w:val="false"/>
-                <w:color w:val="000000"/>
-                <w:sz w:val="19"/>
-                <w:szCs w:val="19"/>
-              </w:rPr>
-              <w:t xml:space="preserve">• Reflection: What should IoT manufacturers do to prevent this class of attacks?</w:t>
-            </w:r>
-          </w:p>
-          <w:p>
-            <w:pPr>
-              <w:spacing w:after="30" w:before="0"/>
-              <w:jc w:val="left"/>
-            </w:pPr>
-            <w:r>
-              <w:rPr>
-                <w:rFonts w:ascii="Arial" w:cs="Arial" w:eastAsia="Arial" w:hAnsi="Arial"/>
-                <w:b w:val="false"/>
-                <w:bCs w:val="false"/>
-                <w:i w:val="false"/>
-                <w:iCs w:val="false"/>
-                <w:color w:val="000000"/>
-                <w:sz w:val="19"/>
-                <w:szCs w:val="19"/>
-              </w:rPr>
-              <w:t xml:space="preserve">• References</w:t>
-            </w:r>
-          </w:p>
-        </w:tc>
-      </w:tr>
-    </w:tbl>
-    <w:p>
-      <w:pPr>
-        <w:spacing w:after="80" w:before="0"/>
-        <w:jc w:val="left"/>
-      </w:pPr>
-      <w:r>
-        <w:rPr>
-          <w:rFonts w:ascii="Arial" w:cs="Arial" w:eastAsia="Arial" w:hAnsi="Arial"/>
-          <w:b w:val="false"/>
-          <w:bCs w:val="false"/>
-          <w:i w:val="false"/>
-          <w:iCs w:val="false"/>
-          <w:color w:val="000000"/>
-          <w:sz w:val="22"/>
-          <w:szCs w:val="22"/>
-        </w:rPr>
-        <w:t xml:space="preserve"/>
-      </w:r>
-    </w:p>
-    <w:tbl>
-      <w:tblPr>
-        <w:tblW w:type="dxa" w:w="9360"/>
-        <w:tblBorders>
-          <w:top w:val="single" w:color="auto" w:sz="4"/>
-          <w:left w:val="single" w:color="auto" w:sz="4"/>
-          <w:bottom w:val="single" w:color="auto" w:sz="4"/>
-          <w:right w:val="single" w:color="auto" w:sz="4"/>
-          <w:insideH w:val="single" w:color="auto" w:sz="4"/>
-          <w:insideV w:val="single" w:color="auto" w:sz="4"/>
-        </w:tblBorders>
-      </w:tblPr>
-      <w:tblGrid>
-        <w:gridCol w:w="9360"/>
-      </w:tblGrid>
-      <w:tr>
-        <w:tc>
-          <w:tcPr>
-            <w:tcW w:type="dxa" w:w="9360"/>
-            <w:tcBorders>
-              <w:top w:val="single" w:color="CCCCCC" w:sz="1"/>
-              <w:left w:val="single" w:color="CCCCCC" w:sz="1"/>
-              <w:bottom w:val="single" w:color="CCCCCC" w:sz="1"/>
-              <w:right w:val="single" w:color="CCCCCC" w:sz="1"/>
-            </w:tcBorders>
-            <w:shd w:fill="FFFFFF" w:val="clear"/>
-            <w:tcMar>
-              <w:top w:type="dxa" w:w="80"/>
-              <w:left w:type="dxa" w:w="120"/>
-              <w:bottom w:type="dxa" w:w="80"/>
-              <w:right w:type="dxa" w:w="120"/>
-            </w:tcMar>
-            <w:vAlign w:val="top"/>
-          </w:tcPr>
-          <w:tbl>
-            <w:tblPr>
-              <w:tblW w:type="dxa" w:w="9260"/>
-              <w:tblBorders>
-                <w:top w:val="single" w:color="auto" w:sz="4"/>
-                <w:left w:val="single" w:color="auto" w:sz="4"/>
-                <w:bottom w:val="single" w:color="auto" w:sz="4"/>
-                <w:right w:val="single" w:color="auto" w:sz="4"/>
-                <w:insideH w:val="single" w:color="auto" w:sz="4"/>
-                <w:insideV w:val="single" w:color="auto" w:sz="4"/>
-              </w:tblBorders>
-              <w:tblCellMar>
-                <w:top w:type="dxa" w:w="0"/>
-                <w:left w:type="dxa" w:w="0"/>
-                <w:bottom w:type="dxa" w:w="0"/>
-                <w:right w:type="dxa" w:w="0"/>
-              </w:tblCellMar>
-            </w:tblPr>
-            <w:tblGrid>
-              <w:gridCol w:w="7560"/>
-              <w:gridCol w:w="1800"/>
-            </w:tblGrid>
-            <w:tr>
-              <w:tc>
-                <w:tcPr>
-                  <w:tcW w:type="dxa" w:w="7560"/>
-                  <w:tcBorders>
-                    <w:top w:val="single" w:color="CCCCCC" w:sz="1"/>
-                    <w:left w:val="single" w:color="CCCCCC" w:sz="1"/>
-                    <w:bottom w:val="single" w:color="CCCCCC" w:sz="1"/>
-                    <w:right w:val="single" w:color="CCCCCC" w:sz="1"/>
-                  </w:tcBorders>
-                  <w:shd w:fill="FFFFFF" w:val="clear"/>
-                  <w:tcMar>
-                    <w:top w:type="dxa" w:w="80"/>
-                    <w:left w:type="dxa" w:w="120"/>
-                    <w:bottom w:type="dxa" w:w="80"/>
-                    <w:right w:type="dxa" w:w="120"/>
-                  </w:tcMar>
-                  <w:vAlign w:val="top"/>
-                </w:tcPr>
-                <w:p>
-                  <w:pPr>
-                    <w:spacing w:after="20" w:before="0"/>
-                    <w:jc w:val="left"/>
-                  </w:pPr>
-                  <w:r>
-                    <w:rPr>
-                      <w:rFonts w:ascii="Arial" w:cs="Arial" w:eastAsia="Arial" w:hAnsi="Arial"/>
-                      <w:b/>
-                      <w:bCs/>
-                      <w:i w:val="false"/>
-                      <w:iCs w:val="false"/>
-                      <w:color w:val="2E7D32"/>
-                      <w:sz w:val="18"/>
-                      <w:szCs w:val="18"/>
-                    </w:rPr>
-                    <w:t xml:space="preserve">Assignment A5</w:t>
-                  </w:r>
-                  <w:r>
-                    <w:rPr>
-                      <w:rFonts w:ascii="Arial" w:cs="Arial" w:eastAsia="Arial" w:hAnsi="Arial"/>
-                      <w:b w:val="false"/>
-                      <w:bCs w:val="false"/>
-                      <w:i w:val="false"/>
-                      <w:iCs w:val="false"/>
-                      <w:color w:val="666666"/>
-                      <w:sz w:val="18"/>
-                      <w:szCs w:val="18"/>
-                    </w:rPr>
-                    <w:t xml:space="preserve">   |   Module 4   |   CO4</w:t>
-                  </w:r>
-                </w:p>
-                <w:p>
-                  <w:pPr>
-                    <w:spacing w:after="80" w:before="0"/>
-                    <w:jc w:val="left"/>
-                  </w:pPr>
-                  <w:r>
-                    <w:rPr>
-                      <w:rFonts w:ascii="Arial" w:cs="Arial" w:eastAsia="Arial" w:hAnsi="Arial"/>
-                      <w:b/>
-                      <w:bCs/>
-                      <w:i w:val="false"/>
-                      <w:iCs w:val="false"/>
-                      <w:color w:val="111111"/>
-                      <w:sz w:val="24"/>
-                      <w:szCs w:val="24"/>
-                    </w:rPr>
-                    <w:t xml:space="preserve">Smart City IoT Architecture Design for a Selected Use Case</w:t>
-                  </w:r>
-                </w:p>
-              </w:tc>
-              <w:tc>
-                <w:tcPr>
-                  <w:tcW w:type="dxa" w:w="1800"/>
-                  <w:tcBorders>
-                    <w:top w:val="single" w:color="CCCCCC" w:sz="1"/>
-                    <w:left w:val="single" w:color="CCCCCC" w:sz="1"/>
-                    <w:bottom w:val="single" w:color="CCCCCC" w:sz="1"/>
-                    <w:right w:val="single" w:color="CCCCCC" w:sz="1"/>
-                  </w:tcBorders>
-                  <w:shd w:fill="FFFFFF" w:val="clear"/>
-                  <w:tcMar>
-                    <w:top w:type="dxa" w:w="80"/>
-                    <w:left w:type="dxa" w:w="120"/>
-                    <w:bottom w:type="dxa" w:w="80"/>
-                    <w:right w:type="dxa" w:w="120"/>
-                  </w:tcMar>
-                  <w:vAlign w:val="center"/>
-                </w:tcPr>
-                <w:p>
-                  <w:pPr>
-                    <w:spacing w:after="10" w:before="0"/>
-                    <w:jc w:val="left"/>
-                  </w:pPr>
-                  <w:r>
-                    <w:rPr>
-                      <w:rFonts w:ascii="Arial" w:cs="Arial" w:eastAsia="Arial" w:hAnsi="Arial"/>
-                      <w:b w:val="false"/>
-                      <w:bCs w:val="false"/>
-                      <w:i w:val="false"/>
-                      <w:iCs w:val="false"/>
-                      <w:color w:val="888888"/>
-                      <w:sz w:val="18"/>
-                      <w:szCs w:val="18"/>
-                    </w:rPr>
-                    <w:t xml:space="preserve">Marks</w:t>
-                  </w:r>
-                </w:p>
-                <w:p>
-                  <w:pPr>
-                    <w:spacing w:after="80" w:before="0"/>
-                    <w:jc w:val="left"/>
-                  </w:pPr>
-                  <w:r>
-                    <w:rPr>
-                      <w:rFonts w:ascii="Arial" w:cs="Arial" w:eastAsia="Arial" w:hAnsi="Arial"/>
-                      <w:b/>
-                      <w:bCs/>
-                      <w:i w:val="false"/>
-                      <w:iCs w:val="false"/>
-                      <w:color w:val="2E7D32"/>
-                      <w:sz w:val="32"/>
-                      <w:szCs w:val="32"/>
-                    </w:rPr>
-                    <w:t xml:space="preserve">10</w:t>
-                  </w:r>
-                </w:p>
-              </w:tc>
-            </w:tr>
-          </w:tbl>
-          <w:p/>
-        </w:tc>
-      </w:tr>
-      <w:tr>
-        <w:tc>
-          <w:tcPr>
-            <w:tcW w:type="dxa" w:w="9360"/>
-            <w:tcBorders>
-              <w:top w:val="none" w:color="FFFFFF" w:sz="0"/>
-              <w:left w:val="none" w:color="FFFFFF" w:sz="0"/>
-              <w:bottom w:val="none" w:color="FFFFFF" w:sz="0"/>
-              <w:right w:val="none" w:color="FFFFFF" w:sz="0"/>
-            </w:tcBorders>
-            <w:shd w:fill="2E7D32" w:val="clear"/>
-            <w:tcMar>
-              <w:top w:type="dxa" w:w="80"/>
-              <w:left w:type="dxa" w:w="120"/>
-              <w:bottom w:type="dxa" w:w="80"/>
-              <w:right w:type="dxa" w:w="120"/>
-            </w:tcMar>
-            <w:vAlign w:val="top"/>
-          </w:tcPr>
-          <w:p>
-            <w:pPr>
-              <w:spacing w:after="80" w:before="0"/>
-              <w:jc w:val="left"/>
-            </w:pPr>
-            <w:r>
-              <w:rPr>
-                <w:rFonts w:ascii="Arial" w:cs="Arial" w:eastAsia="Arial" w:hAnsi="Arial"/>
-                <w:b w:val="false"/>
-                <w:bCs w:val="false"/>
-                <w:i w:val="false"/>
-                <w:iCs w:val="false"/>
-                <w:color w:val="000000"/>
-                <w:sz w:val="22"/>
-                <w:szCs w:val="22"/>
-              </w:rPr>
-              <w:t xml:space="preserve"/>
-            </w:r>
-          </w:p>
-        </w:tc>
-      </w:tr>
-      <w:tr>
-        <w:tc>
-          <w:tcPr>
-            <w:tcW w:type="dxa" w:w="1800"/>
-            <w:tcBorders>
-              <w:top w:val="single" w:color="CCCCCC" w:sz="1"/>
-              <w:left w:val="single" w:color="CCCCCC" w:sz="1"/>
-              <w:bottom w:val="single" w:color="CCCCCC" w:sz="1"/>
-              <w:right w:val="single" w:color="CCCCCC" w:sz="1"/>
-            </w:tcBorders>
-            <w:shd w:fill="E8F5E9" w:val="clear"/>
-            <w:tcMar>
-              <w:top w:type="dxa" w:w="80"/>
-              <w:left w:type="dxa" w:w="120"/>
-              <w:bottom w:type="dxa" w:w="80"/>
-              <w:right w:type="dxa" w:w="120"/>
-            </w:tcMar>
-            <w:vAlign w:val="top"/>
-          </w:tcPr>
-          <w:p>
-            <w:pPr>
-              <w:spacing w:after="80" w:before="0"/>
-              <w:jc w:val="left"/>
-            </w:pPr>
-            <w:r>
-              <w:rPr>
-                <w:rFonts w:ascii="Arial" w:cs="Arial" w:eastAsia="Arial" w:hAnsi="Arial"/>
-                <w:b/>
-                <w:bCs/>
-                <w:i w:val="false"/>
-                <w:iCs w:val="false"/>
-                <w:color w:val="444444"/>
-                <w:sz w:val="19"/>
-                <w:szCs w:val="19"/>
-              </w:rPr>
-              <w:t xml:space="preserve">Tools</w:t>
-            </w:r>
-          </w:p>
-        </w:tc>
-        <w:tc>
-          <w:tcPr>
-            <w:tcW w:type="dxa" w:w="7560"/>
-            <w:tcBorders>
-              <w:top w:val="single" w:color="CCCCCC" w:sz="1"/>
-              <w:left w:val="single" w:color="CCCCCC" w:sz="1"/>
-              <w:bottom w:val="single" w:color="CCCCCC" w:sz="1"/>
-              <w:right w:val="single" w:color="CCCCCC" w:sz="1"/>
-            </w:tcBorders>
-            <w:shd w:fill="E8F5E9" w:val="clear"/>
-            <w:tcMar>
-              <w:top w:type="dxa" w:w="80"/>
-              <w:left w:type="dxa" w:w="120"/>
-              <w:bottom w:type="dxa" w:w="80"/>
-              <w:right w:type="dxa" w:w="120"/>
-            </w:tcMar>
-            <w:vAlign w:val="top"/>
-          </w:tcPr>
-          <w:p>
-            <w:pPr>
-              <w:spacing w:after="80" w:before="0"/>
-              <w:jc w:val="left"/>
-            </w:pPr>
-            <w:r>
-              <w:rPr>
-                <w:rFonts w:ascii="Arial" w:cs="Arial" w:eastAsia="Arial" w:hAnsi="Arial"/>
-                <w:b w:val="false"/>
-                <w:bCs w:val="false"/>
-                <w:i w:val="false"/>
-                <w:iCs w:val="false"/>
-                <w:color w:val="000000"/>
-                <w:sz w:val="19"/>
-                <w:szCs w:val="19"/>
-              </w:rPr>
-              <w:t xml:space="preserve">Module 4 notes, TB2, internet research on smart city deployments</w:t>
-            </w:r>
-          </w:p>
-        </w:tc>
-      </w:tr>
-      <w:tr>
-        <w:tc>
-          <w:tcPr>
-            <w:tcW w:type="dxa" w:w="1800"/>
-            <w:tcBorders>
-              <w:top w:val="single" w:color="CCCCCC" w:sz="1"/>
-              <w:left w:val="single" w:color="CCCCCC" w:sz="1"/>
-              <w:bottom w:val="single" w:color="CCCCCC" w:sz="1"/>
-              <w:right w:val="single" w:color="CCCCCC" w:sz="1"/>
-            </w:tcBorders>
-            <w:shd w:fill="E8F5E9" w:val="clear"/>
-            <w:tcMar>
-              <w:top w:type="dxa" w:w="80"/>
-              <w:left w:type="dxa" w:w="120"/>
-              <w:bottom w:type="dxa" w:w="80"/>
-              <w:right w:type="dxa" w:w="120"/>
-            </w:tcMar>
-            <w:vAlign w:val="top"/>
-          </w:tcPr>
-          <w:p>
-            <w:pPr>
-              <w:spacing w:after="80" w:before="0"/>
-              <w:jc w:val="left"/>
-            </w:pPr>
-            <w:r>
-              <w:rPr>
-                <w:rFonts w:ascii="Arial" w:cs="Arial" w:eastAsia="Arial" w:hAnsi="Arial"/>
-                <w:b/>
-                <w:bCs/>
-                <w:i w:val="false"/>
-                <w:iCs w:val="false"/>
-                <w:color w:val="444444"/>
-                <w:sz w:val="19"/>
-                <w:szCs w:val="19"/>
-              </w:rPr>
-              <w:t xml:space="preserve">Description</w:t>
-            </w:r>
-          </w:p>
-        </w:tc>
-        <w:tc>
-          <w:tcPr>
-            <w:tcW w:type="dxa" w:w="7560"/>
-            <w:tcBorders>
-              <w:top w:val="single" w:color="CCCCCC" w:sz="1"/>
-              <w:left w:val="single" w:color="CCCCCC" w:sz="1"/>
-              <w:bottom w:val="single" w:color="CCCCCC" w:sz="1"/>
-              <w:right w:val="single" w:color="CCCCCC" w:sz="1"/>
-            </w:tcBorders>
-            <w:shd w:fill="E8F5E9" w:val="clear"/>
-            <w:tcMar>
-              <w:top w:type="dxa" w:w="80"/>
-              <w:left w:type="dxa" w:w="120"/>
-              <w:bottom w:type="dxa" w:w="80"/>
-              <w:right w:type="dxa" w:w="120"/>
-            </w:tcMar>
-            <w:vAlign w:val="top"/>
-          </w:tcPr>
-          <w:p>
-            <w:pPr>
-              <w:spacing w:after="80" w:before="0"/>
-              <w:jc w:val="left"/>
-            </w:pPr>
-            <w:r>
-              <w:rPr>
-                <w:rFonts w:ascii="Arial" w:cs="Arial" w:eastAsia="Arial" w:hAnsi="Arial"/>
-                <w:b w:val="false"/>
-                <w:bCs w:val="false"/>
-                <w:i w:val="false"/>
-                <w:iCs w:val="false"/>
-                <w:color w:val="000000"/>
-                <w:sz w:val="19"/>
-                <w:szCs w:val="19"/>
-              </w:rPr>
-              <w:t xml:space="preserve">Design a Smart City IoT Architecture for ONE of the following scenarios: (a) Smart Street Lighting for a 2 km road, (b) Smart Waste Management for a ward with 500 houses, (c) Smart Traffic Signal System for a 4-way junction, (d) Smart Water Quality Monitoring for a river stretch. Use the 4-layer Smart City IoT Architecture (Street Layer, City Layer, Data Centre Layer, Services Layer) as your design framework.</w:t>
-            </w:r>
-          </w:p>
-        </w:tc>
-      </w:tr>
-      <w:tr>
-        <w:tc>
-          <w:tcPr>
-            <w:tcW w:type="dxa" w:w="1800"/>
-            <w:tcBorders>
-              <w:top w:val="single" w:color="CCCCCC" w:sz="1"/>
-              <w:left w:val="single" w:color="CCCCCC" w:sz="1"/>
-              <w:bottom w:val="single" w:color="CCCCCC" w:sz="1"/>
-              <w:right w:val="single" w:color="CCCCCC" w:sz="1"/>
-            </w:tcBorders>
-            <w:shd w:fill="E8F5E9" w:val="clear"/>
-            <w:tcMar>
-              <w:top w:type="dxa" w:w="80"/>
-              <w:left w:type="dxa" w:w="120"/>
-              <w:bottom w:type="dxa" w:w="80"/>
-              <w:right w:type="dxa" w:w="120"/>
-            </w:tcMar>
-            <w:vAlign w:val="top"/>
-          </w:tcPr>
-          <w:p>
-            <w:pPr>
-              <w:spacing w:after="80" w:before="0"/>
-              <w:jc w:val="left"/>
-            </w:pPr>
-            <w:r>
-              <w:rPr>
-                <w:rFonts w:ascii="Arial" w:cs="Arial" w:eastAsia="Arial" w:hAnsi="Arial"/>
-                <w:b/>
-                <w:bCs/>
-                <w:i w:val="false"/>
-                <w:iCs w:val="false"/>
-                <w:color w:val="444444"/>
-                <w:sz w:val="19"/>
-                <w:szCs w:val="19"/>
-              </w:rPr>
-              <w:t xml:space="preserve">Deliverables</w:t>
-            </w:r>
-          </w:p>
-        </w:tc>
-        <w:tc>
-          <w:tcPr>
-            <w:tcW w:type="dxa" w:w="7560"/>
-            <w:tcBorders>
-              <w:top w:val="single" w:color="CCCCCC" w:sz="1"/>
-              <w:left w:val="single" w:color="CCCCCC" w:sz="1"/>
-              <w:bottom w:val="single" w:color="CCCCCC" w:sz="1"/>
-              <w:right w:val="single" w:color="CCCCCC" w:sz="1"/>
-            </w:tcBorders>
-            <w:shd w:fill="E8F5E9" w:val="clear"/>
-            <w:tcMar>
-              <w:top w:type="dxa" w:w="80"/>
-              <w:left w:type="dxa" w:w="120"/>
-              <w:bottom w:type="dxa" w:w="80"/>
-              <w:right w:type="dxa" w:w="120"/>
-            </w:tcMar>
-            <w:vAlign w:val="top"/>
-          </w:tcPr>
-          <w:p>
-            <w:pPr>
-              <w:spacing w:after="30" w:before="0"/>
-              <w:jc w:val="left"/>
-            </w:pPr>
-            <w:r>
-              <w:rPr>
-                <w:rFonts w:ascii="Arial" w:cs="Arial" w:eastAsia="Arial" w:hAnsi="Arial"/>
-                <w:b w:val="false"/>
-                <w:bCs w:val="false"/>
-                <w:i w:val="false"/>
-                <w:iCs w:val="false"/>
-                <w:color w:val="000000"/>
-                <w:sz w:val="19"/>
-                <w:szCs w:val="19"/>
-              </w:rPr>
-              <w:t xml:space="preserve">• Use case description and problem statement (0.5 page)</w:t>
-            </w:r>
-          </w:p>
-          <w:p>
-            <w:pPr>
-              <w:spacing w:after="30" w:before="0"/>
-              <w:jc w:val="left"/>
-            </w:pPr>
-            <w:r>
-              <w:rPr>
-                <w:rFonts w:ascii="Arial" w:cs="Arial" w:eastAsia="Arial" w:hAnsi="Arial"/>
-                <w:b w:val="false"/>
-                <w:bCs w:val="false"/>
-                <w:i w:val="false"/>
-                <w:iCs w:val="false"/>
-                <w:color w:val="000000"/>
-                <w:sz w:val="19"/>
-                <w:szCs w:val="19"/>
-              </w:rPr>
-              <w:t xml:space="preserve">• Sensor and actuator selection with justification — type, placement, quantity (1 page)</w:t>
-            </w:r>
-          </w:p>
-          <w:p>
-            <w:pPr>
-              <w:spacing w:after="30" w:before="0"/>
-              <w:jc w:val="left"/>
-            </w:pPr>
-            <w:r>
-              <w:rPr>
-                <w:rFonts w:ascii="Arial" w:cs="Arial" w:eastAsia="Arial" w:hAnsi="Arial"/>
-                <w:b w:val="false"/>
-                <w:bCs w:val="false"/>
-                <w:i w:val="false"/>
-                <w:iCs w:val="false"/>
-                <w:color w:val="000000"/>
-                <w:sz w:val="19"/>
-                <w:szCs w:val="19"/>
-              </w:rPr>
-              <w:t xml:space="preserve">• Street Layer design: node placement diagram (hand-drawn or draw.io) (1 page)</w:t>
-            </w:r>
-          </w:p>
-          <w:p>
-            <w:pPr>
-              <w:spacing w:after="30" w:before="0"/>
-              <w:jc w:val="left"/>
-            </w:pPr>
-            <w:r>
-              <w:rPr>
-                <w:rFonts w:ascii="Arial" w:cs="Arial" w:eastAsia="Arial" w:hAnsi="Arial"/>
-                <w:b w:val="false"/>
-                <w:bCs w:val="false"/>
-                <w:i w:val="false"/>
-                <w:iCs w:val="false"/>
-                <w:color w:val="000000"/>
-                <w:sz w:val="19"/>
-                <w:szCs w:val="19"/>
-              </w:rPr>
-              <w:t xml:space="preserve">• City Layer: gateway selection, protocol, connectivity (0.5 page)</w:t>
-            </w:r>
-          </w:p>
-          <w:p>
-            <w:pPr>
-              <w:spacing w:after="30" w:before="0"/>
-              <w:jc w:val="left"/>
-            </w:pPr>
-            <w:r>
-              <w:rPr>
-                <w:rFonts w:ascii="Arial" w:cs="Arial" w:eastAsia="Arial" w:hAnsi="Arial"/>
-                <w:b w:val="false"/>
-                <w:bCs w:val="false"/>
-                <w:i w:val="false"/>
-                <w:iCs w:val="false"/>
-                <w:color w:val="000000"/>
-                <w:sz w:val="19"/>
-                <w:szCs w:val="19"/>
-              </w:rPr>
-              <w:t xml:space="preserve">• Data Centre Layer: cloud platform, storage, analytics plan (0.5 page)</w:t>
-            </w:r>
-          </w:p>
-          <w:p>
-            <w:pPr>
-              <w:spacing w:after="30" w:before="0"/>
-              <w:jc w:val="left"/>
-            </w:pPr>
-            <w:r>
-              <w:rPr>
-                <w:rFonts w:ascii="Arial" w:cs="Arial" w:eastAsia="Arial" w:hAnsi="Arial"/>
-                <w:b w:val="false"/>
-                <w:bCs w:val="false"/>
-                <w:i w:val="false"/>
-                <w:iCs w:val="false"/>
-                <w:color w:val="000000"/>
-                <w:sz w:val="19"/>
-                <w:szCs w:val="19"/>
-              </w:rPr>
-              <w:t xml:space="preserve">• Services Layer: end-user application mockup (dashboard sketch acceptable) (0.5 page)</w:t>
-            </w:r>
-          </w:p>
-          <w:p>
-            <w:pPr>
-              <w:spacing w:after="30" w:before="0"/>
-              <w:jc w:val="left"/>
-            </w:pPr>
-            <w:r>
-              <w:rPr>
-                <w:rFonts w:ascii="Arial" w:cs="Arial" w:eastAsia="Arial" w:hAnsi="Arial"/>
-                <w:b w:val="false"/>
-                <w:bCs w:val="false"/>
-                <w:i w:val="false"/>
-                <w:iCs w:val="false"/>
-                <w:color w:val="000000"/>
-                <w:sz w:val="19"/>
-                <w:szCs w:val="19"/>
-              </w:rPr>
-              <w:t xml:space="preserve">• Cost estimate table: sensors, gateways, connectivity, cloud (0.5 page)</w:t>
-            </w:r>
-          </w:p>
-          <w:p>
-            <w:pPr>
-              <w:spacing w:after="30" w:before="0"/>
-              <w:jc w:val="left"/>
-            </w:pPr>
-            <w:r>
-              <w:rPr>
-                <w:rFonts w:ascii="Arial" w:cs="Arial" w:eastAsia="Arial" w:hAnsi="Arial"/>
-                <w:b w:val="false"/>
-                <w:bCs w:val="false"/>
-                <w:i w:val="false"/>
-                <w:iCs w:val="false"/>
-                <w:color w:val="000000"/>
-                <w:sz w:val="19"/>
-                <w:szCs w:val="19"/>
-              </w:rPr>
-              <w:t xml:space="preserve">• References</w:t>
-            </w:r>
-          </w:p>
-        </w:tc>
-      </w:tr>
-    </w:tbl>
-    <w:p>
-      <w:pPr>
-        <w:spacing w:after="80" w:before="0"/>
-        <w:jc w:val="left"/>
-      </w:pPr>
-      <w:r>
-        <w:br w:type="page"/>
-      </w:r>
-    </w:p>
-    <w:tbl>
-      <w:tblPr>
-        <w:tblW w:type="dxa" w:w="9360"/>
-        <w:tblBorders>
-          <w:top w:val="single" w:color="auto" w:sz="4"/>
-          <w:left w:val="single" w:color="auto" w:sz="4"/>
-          <w:bottom w:val="single" w:color="auto" w:sz="4"/>
-          <w:right w:val="single" w:color="auto" w:sz="4"/>
-          <w:insideH w:val="single" w:color="auto" w:sz="4"/>
-          <w:insideV w:val="single" w:color="auto" w:sz="4"/>
-        </w:tblBorders>
-      </w:tblPr>
-      <w:tblGrid>
-        <w:gridCol w:w="9360"/>
-      </w:tblGrid>
-      <w:tr>
-        <w:tc>
-          <w:tcPr>
-            <w:tcW w:type="dxa" w:w="9360"/>
-            <w:tcBorders>
-              <w:top w:val="none" w:color="FFFFFF" w:sz="0"/>
-              <w:left w:val="none" w:color="FFFFFF" w:sz="0"/>
-              <w:bottom w:val="none" w:color="FFFFFF" w:sz="0"/>
-              <w:right w:val="none" w:color="FFFFFF" w:sz="0"/>
-            </w:tcBorders>
-            <w:shd w:fill="E65100" w:val="clear"/>
-            <w:tcMar>
-              <w:top w:type="dxa" w:w="80"/>
-              <w:left w:type="dxa" w:w="120"/>
-              <w:bottom w:type="dxa" w:w="80"/>
-              <w:right w:type="dxa" w:w="120"/>
-            </w:tcMar>
-            <w:vAlign w:val="top"/>
-          </w:tcPr>
-          <w:p>
-            <w:pPr>
-              <w:spacing w:after="20" w:before="40"/>
-              <w:jc w:val="left"/>
-            </w:pPr>
-            <w:r>
-              <w:rPr>
-                <w:rFonts w:ascii="Arial" w:cs="Arial" w:eastAsia="Arial" w:hAnsi="Arial"/>
-                <w:b/>
-                <w:bCs/>
-                <w:i w:val="false"/>
-                <w:iCs w:val="false"/>
-                <w:color w:val="FFFFFF"/>
-                <w:sz w:val="28"/>
-                <w:szCs w:val="28"/>
-              </w:rPr>
-              <w:t xml:space="preserve">SET B — HANDS-ON PROJECTS</w:t>
-            </w:r>
-          </w:p>
-          <w:p>
-            <w:pPr>
-              <w:spacing w:after="40" w:before="0"/>
-              <w:jc w:val="left"/>
-            </w:pPr>
-            <w:r>
-              <w:rPr>
-                <w:rFonts w:ascii="Arial" w:cs="Arial" w:eastAsia="Arial" w:hAnsi="Arial"/>
-                <w:b w:val="false"/>
-                <w:bCs w:val="false"/>
-                <w:i w:val="false"/>
-                <w:iCs w:val="false"/>
-                <w:color w:val="DEEAF1"/>
-                <w:sz w:val="20"/>
-                <w:szCs w:val="20"/>
-              </w:rPr>
-              <w:t xml:space="preserve">Working software or hardware implementations  |  Submit: code + screenshots + demo video (1–2 min)  |  5 marks each</w:t>
+              <w:t xml:space="preserve">Working software or hardware implementations  |  Submit: code + screenshots + demo video (max 2 min)  |  5 marks each</w:t>
             </w:r>
           </w:p>
         </w:tc>
@@ -3514,7 +483,7 @@
                       <w:sz w:val="18"/>
                       <w:szCs w:val="18"/>
                     </w:rPr>
-                    <w:t xml:space="preserve">   |   Module 2 &amp; 4   |   CO2, CO5</w:t>
+                    <w:t xml:space="preserve">   |   Module 3 &amp; 4   |   CO3, CO5</w:t>
                   </w:r>
                 </w:p>
                 <w:p>
@@ -3533,7 +502,7 @@
                       <w:sz w:val="24"/>
                       <w:szCs w:val="24"/>
                     </w:rPr>
-                    <w:t xml:space="preserve">Smart Street Light Simulation (Tinkercad)</w:t>
+                    <w:t xml:space="preserve">Wireless Digital Notice Board for College Campus using LoRa</w:t>
                   </w:r>
                 </w:p>
               </w:tc>
@@ -3590,7 +559,7 @@
                       <w:sz w:val="32"/>
                       <w:szCs w:val="32"/>
                     </w:rPr>
-                    <w:t xml:space="preserve">10</w:t>
+                    <w:t xml:space="preserve">5</w:t>
                   </w:r>
                 </w:p>
               </w:tc>
@@ -3712,7 +681,7 @@
                 <w:sz w:val="19"/>
                 <w:szCs w:val="19"/>
               </w:rPr>
-              <w:t xml:space="preserve">Tinkercad Circuits (free, browser-based — tinkercad.com)  |  No hardware required</w:t>
+              <w:t xml:space="preserve">2x Arduino Uno, 2x LoRa SX1278 (Ra-02) module, 20x4 LCD (I2C) or OLED SSD1306, keypad (4x4), buzzer, jumper wires</w:t>
             </w:r>
           </w:p>
         </w:tc>
@@ -3790,7 +759,7 @@
                 <w:sz w:val="19"/>
                 <w:szCs w:val="19"/>
               </w:rPr>
-              <w:t xml:space="preserve">Simulate a smart street light system using Arduino in Tinkercad. The system must: read ambient light level using an LDR (photoresistor), automatically turn ON the LED street light when light level falls below a threshold, display the current light level and ON/OFF status on the Serial Monitor, and optionally display status on an LCD. This simulates a real IoT street light node (IoT Level 1 — Module 1).</w:t>
+              <w:t xml:space="preserve">Problem Statement: Paper notice boards at JECC require manual updates and notices posted in one block do not reach students in distant classrooms or labs immediately. Faculty must physically walk to each notice board, causing delays in time-critical announcements. Design a wireless digital notice board system where a sender unit (Arduino + LoRa) at the office allows faculty to type a notice using a 4x4 keypad and transmit it wirelessly over LoRa to one or more receiver display units (Arduino + LoRa + LCD) mounted in classrooms. The receiver must display the incoming notice text with a buzzer alert, show the sender ID and timestamp, and hold the last notice until a new one is received. Packet delivery must be acknowledged (ACK) — the sender should retry up to 3 times if no ACK is received, covering the LPWAN reliability concepts from Module 3.</w:t>
             </w:r>
           </w:p>
         </w:tc>
@@ -3868,7 +837,7 @@
                 <w:sz w:val="19"/>
                 <w:szCs w:val="19"/>
               </w:rPr>
-              <w:t xml:space="preserve">• Tinkercad circuit screenshot showing all components connected</w:t>
+              <w:t xml:space="preserve">• Circuit diagram: sender unit (keypad + Arduino + LoRa) and receiver unit (Arduino + LoRa + LCD)</w:t>
             </w:r>
           </w:p>
           <w:p>
@@ -3887,7 +856,7 @@
                 <w:sz w:val="19"/>
                 <w:szCs w:val="19"/>
               </w:rPr>
-              <w:t xml:space="preserve">• Tinkercad shareable link (public, anyone can view)</w:t>
+              <w:t xml:space="preserve">• notice_sender.ino — keypad input, LoRa packet transmit, ACK wait with 3-retry logic</w:t>
             </w:r>
           </w:p>
           <w:p>
@@ -3906,7 +875,7 @@
                 <w:sz w:val="19"/>
                 <w:szCs w:val="19"/>
               </w:rPr>
-              <w:t xml:space="preserve">• Arduino code (.ino file) — with comments explaining each section</w:t>
+              <w:t xml:space="preserve">• notice_receiver.ino — LoRa receive, LCD display, buzzer alert, ACK reply</w:t>
             </w:r>
           </w:p>
           <w:p>
@@ -3925,7 +894,7 @@
                 <w:sz w:val="19"/>
                 <w:szCs w:val="19"/>
               </w:rPr>
-              <w:t xml:space="preserve">• Serial Monitor screenshot showing sensor readings and threshold logic</w:t>
+              <w:t xml:space="preserve">• Demo video (max 2 min): type notice on sender, verify display on receiver with RSSI shown on Serial Monitor</w:t>
             </w:r>
           </w:p>
           <w:p>
@@ -3944,7 +913,7 @@
                 <w:sz w:val="19"/>
                 <w:szCs w:val="19"/>
               </w:rPr>
-              <w:t xml:space="preserve">• One-page report: circuit explanation, LDR working principle, threshold value chosen and why</w:t>
+              <w:t xml:space="preserve">• One-page report: LoRa packet structure (header, payload, ACK), range tested on campus, IoT level classification, comparison with Wi-Fi/Bluetooth for this use case</w:t>
             </w:r>
           </w:p>
         </w:tc>
@@ -4073,7 +1042,7 @@
                       <w:sz w:val="18"/>
                       <w:szCs w:val="18"/>
                     </w:rPr>
-                    <w:t xml:space="preserve">   |   Module 1 &amp; 3   |   CO1, CO3</w:t>
+                    <w:t xml:space="preserve">   |   Module 2 &amp; 4   |   CO2, CO5</w:t>
                   </w:r>
                 </w:p>
                 <w:p>
@@ -4092,7 +1061,7 @@
                       <w:sz w:val="24"/>
                       <w:szCs w:val="24"/>
                     </w:rPr>
-                    <w:t xml:space="preserve">MQTT Publish-Subscribe Communication Demo (Python)</w:t>
+                    <w:t xml:space="preserve">IoT-Enabled Smart Classroom — Occupancy, Climate and Energy Control</w:t>
                   </w:r>
                 </w:p>
               </w:tc>
@@ -4149,7 +1118,7 @@
                       <w:sz w:val="32"/>
                       <w:szCs w:val="32"/>
                     </w:rPr>
-                    <w:t xml:space="preserve">10</w:t>
+                    <w:t xml:space="preserve">5</w:t>
                   </w:r>
                 </w:p>
               </w:tc>
@@ -4271,7 +1240,7 @@
                 <w:sz w:val="19"/>
                 <w:szCs w:val="19"/>
               </w:rPr>
-              <w:t xml:space="preserve">Python 3, paho-mqtt library (pip install paho-mqtt), HiveMQ public broker (no account needed)</w:t>
+              <w:t xml:space="preserve">Raspberry Pi 3/4, PIR motion sensor, DHT11, LDR, 2x relay module (for fan/light), 16x2 I2C LCD, LED, buzzer, breadboard, jumper wires</w:t>
             </w:r>
           </w:p>
         </w:tc>
@@ -4349,7 +1318,7 @@
                 <w:sz w:val="19"/>
                 <w:szCs w:val="19"/>
               </w:rPr>
-              <w:t xml:space="preserve">Implement the MQTT Publish-Subscribe communication model (studied in Module 1) using Python. Write TWO Python scripts: (1) Publisher — simulates an IoT temperature sensor publishing readings every 5 seconds to topic 'iot/sensor/temperature', (2) Subscriber — connects to the same broker and prints received messages with timestamp. Use the free public broker: broker.hivemq.com:1883. Demonstrate all three QoS levels (0, 1, 2) and explain the difference.</w:t>
+              <w:t xml:space="preserve">Problem Statement: Classrooms at JECC frequently waste electricity — fans and lights remain ON in empty rooms, air becomes stale during long sessions with no ventilation feedback, and there is no visibility of room occupancy for timetable planning. Build an IoT-enabled smart classroom controller using Raspberry Pi that: (1) detects room occupancy using a PIR motion sensor — if no motion is detected for 5 minutes, automatically switch OFF the fan and light relays; (2) reads temperature and humidity via DHT11 and switches ON the fan relay if temperature exceeds 30 degrees C regardless of occupancy; (3) reads ambient light level via LDR and switches ON the light relay when natural light is insufficient (below threshold); (4) displays occupancy status, temperature, humidity, and relay states on a 16x2 I2C LCD refreshing every 3 seconds; (5) logs all events (occupancy change, relay trigger, readings) with timestamp to a CSV file for energy audit. This implements a real IoT Level 2 system as classified in Module 1 with GPIO and I2C interfacing from Module 4 (Experiments E3, E4, E7).</w:t>
             </w:r>
           </w:p>
         </w:tc>
@@ -4427,7 +1396,7 @@
                 <w:sz w:val="19"/>
                 <w:szCs w:val="19"/>
               </w:rPr>
-              <w:t xml:space="preserve">• publisher.py — simulates temperature readings (18–40°C random), publishes every 5 sec</w:t>
+              <w:t xml:space="preserve">• Circuit diagram showing all sensors, relays, and LCD connected to RPi GPIO</w:t>
             </w:r>
           </w:p>
           <w:p>
@@ -4446,7 +1415,7 @@
                 <w:sz w:val="19"/>
                 <w:szCs w:val="19"/>
               </w:rPr>
-              <w:t xml:space="preserve">• subscriber.py — receives and displays messages with timestamp and QoS level</w:t>
+              <w:t xml:space="preserve">• smart_classroom.py — PIR, DHT11, LDR read; relay auto-control logic; LCD update; CSV event log</w:t>
             </w:r>
           </w:p>
           <w:p>
@@ -4465,7 +1434,7 @@
                 <w:sz w:val="19"/>
                 <w:szCs w:val="19"/>
               </w:rPr>
-              <w:t xml:space="preserve">• Screenshot: both scripts running simultaneously in two terminal windows</w:t>
+              <w:t xml:space="preserve">• Terminal screenshot showing event log entries and relay state changes over 5 minutes</w:t>
             </w:r>
           </w:p>
           <w:p>
@@ -4484,7 +1453,7 @@
                 <w:sz w:val="19"/>
                 <w:szCs w:val="19"/>
               </w:rPr>
-              <w:t xml:space="preserve">• HiveMQ Web Client screenshot (https://www.hivemq.com/demos/websocket-client/) showing messages</w:t>
+              <w:t xml:space="preserve">• LCD photo/screenshot showing occupancy, temperature, and relay status</w:t>
             </w:r>
           </w:p>
           <w:p>
@@ -4503,7 +1472,7 @@
                 <w:sz w:val="19"/>
                 <w:szCs w:val="19"/>
               </w:rPr>
-              <w:t xml:space="preserve">• One-page report: explain how this implements the Pub-Sub model, broker role, QoS 0 vs 1 vs 2</w:t>
+              <w:t xml:space="preserve">• One-page report: GPIO pin mapping table, relay wiring (normally open/closed), energy saving estimate (hours x watts), IoT level classification</w:t>
             </w:r>
           </w:p>
         </w:tc>
@@ -4632,7 +1601,7 @@
                       <w:sz w:val="18"/>
                       <w:szCs w:val="18"/>
                     </w:rPr>
-                    <w:t xml:space="preserve">   |   Module 3 &amp; 4   |   CO3, CO4</w:t>
+                    <w:t xml:space="preserve">   |   Module 4   |   CO5</w:t>
                   </w:r>
                 </w:p>
                 <w:p>
@@ -4651,7 +1620,7 @@
                       <w:sz w:val="24"/>
                       <w:szCs w:val="24"/>
                     </w:rPr>
-                    <w:t xml:space="preserve">IoT Data Pipeline using Node-RED Dashboard</w:t>
+                    <w:t xml:space="preserve">IoT Laboratory Equipment Health Monitoring System (UART + SPI + I2C)</w:t>
                   </w:r>
                 </w:p>
               </w:tc>
@@ -4708,7 +1677,7 @@
                       <w:sz w:val="32"/>
                       <w:szCs w:val="32"/>
                     </w:rPr>
-                    <w:t xml:space="preserve">10</w:t>
+                    <w:t xml:space="preserve">5</w:t>
                   </w:r>
                 </w:p>
               </w:tc>
@@ -4830,7 +1799,7 @@
                 <w:sz w:val="19"/>
                 <w:szCs w:val="19"/>
               </w:rPr>
-              <w:t xml:space="preserve">Node-RED (npm install -g node-red), any laptop/PC — no hardware needed</w:t>
+              <w:t xml:space="preserve">Raspberry Pi, Arduino Uno, ACS712 current sensor, MCP3208 SPI ADC, SHT31 or MPU-6050 I2C sensor, relay, breadboard, jumper wires</w:t>
             </w:r>
           </w:p>
         </w:tc>
@@ -4908,7 +1877,7 @@
                 <w:sz w:val="19"/>
                 <w:szCs w:val="19"/>
               </w:rPr>
-              <w:t xml:space="preserve">Build a working IoT data pipeline using Node-RED that simulates sensor data collection, processes it, and visualises it on a live dashboard. The pipeline must include: (a) Inject node — generates simulated temperature and humidity values every 3 seconds, (b) Function node — checks if temperature &gt; 35°C and triggers an 'ALERT' flag, (c) MQTT Out → MQTT In nodes — demonstrates messaging, (d) Dashboard nodes — Gauge for temperature, Chart for historical trend, Text indicator for alert status.</w:t>
+              <w:t xml:space="preserve">Problem Statement: In JECC labs, equipment failures — oscilloscopes, power supplies, soldering stations — go undetected until a student tries to use them, wasting valuable lab hours. There is no centralised system to check if equipment is powered and operating within safe thermal and electrical limits before a lab session begins. Build a Raspberry Pi-based lab equipment health monitoring hub that interfaces with three measurement channels simultaneously over different protocols: (1) UART — Arduino reads load current from an ACS712 sensor (connected to a lamp or fan as representative lab load) and sends current value as a serial string every 3 seconds; (2) SPI — MCP3208 ADC reads supply voltage level (via voltage divider on CH0) and returns a digital value; (3) I2C — SHT31 or MPU-6050 reads equipment enclosure temperature. The RPi aggregates all three channels and prints a unified equipment health report to a terminal dashboard every 3 seconds, flagging any channel that exceeds safe limits (overcurrent, overvoltage, overtemperature). This directly maps to Experiments E5 (UART), E6 (SPI), and E7 (I2C).</w:t>
             </w:r>
           </w:p>
         </w:tc>
@@ -4986,7 +1955,7 @@
                 <w:sz w:val="19"/>
                 <w:szCs w:val="19"/>
               </w:rPr>
-              <w:t xml:space="preserve">• Node-RED flow export file (.json) — must be importable</w:t>
+              <w:t xml:space="preserve">• Circuit diagram showing Arduino + ACS712 (UART), MCP3208 (SPI), and SHT31/MPU-6050 (I2C) all wired to RPi</w:t>
             </w:r>
           </w:p>
           <w:p>
@@ -5005,7 +1974,7 @@
                 <w:sz w:val="19"/>
                 <w:szCs w:val="19"/>
               </w:rPr>
-              <w:t xml:space="preserve">• Screenshot of the complete flow in the Node-RED editor</w:t>
+              <w:t xml:space="preserve">• equipment_node.ino — ACS712 read, formatted serial string transmit every 3 sec</w:t>
             </w:r>
           </w:p>
           <w:p>
@@ -5024,7 +1993,7 @@
                 <w:sz w:val="19"/>
                 <w:szCs w:val="19"/>
               </w:rPr>
-              <w:t xml:space="preserve">• Screenshot of the running dashboard (browser) showing gauge, chart, and alert</w:t>
+              <w:t xml:space="preserve">• health_monitor.py — concurrent UART, SPI, I2C reads; threshold check; unified terminal dashboard</w:t>
             </w:r>
           </w:p>
           <w:p>
@@ -5043,7 +2012,7 @@
                 <w:sz w:val="19"/>
                 <w:szCs w:val="19"/>
               </w:rPr>
-              <w:t xml:space="preserve">• Screenshot showing the alert triggered when temperature &gt; 35°C</w:t>
+              <w:t xml:space="preserve">• Terminal screenshot showing health report with at least one threshold violation flagged</w:t>
             </w:r>
           </w:p>
           <w:p>
@@ -5062,7 +2031,7 @@
                 <w:sz w:val="19"/>
                 <w:szCs w:val="19"/>
               </w:rPr>
-              <w:t xml:space="preserve">• One-page report: explain each node's role, how this represents an IoT data pipeline, and cloud deployment potential</w:t>
+              <w:t xml:space="preserve">• One-page report: SPI CS pin and clock speed, I2C device address, UART baud rate, threshold values chosen and why, how this scales to a full lab</w:t>
             </w:r>
           </w:p>
         </w:tc>
@@ -5191,7 +2160,7 @@
                       <w:sz w:val="18"/>
                       <w:szCs w:val="18"/>
                     </w:rPr>
-                    <w:t xml:space="preserve">   |   Module 4   |   CO5</w:t>
+                    <w:t xml:space="preserve">   |   Module 1, 3 &amp; 4   |   CO1, CO3, CO5</w:t>
                   </w:r>
                 </w:p>
                 <w:p>
@@ -5210,7 +2179,7 @@
                       <w:sz w:val="24"/>
                       <w:szCs w:val="24"/>
                     </w:rPr>
-                    <w:t xml:space="preserve">Raspberry Pi Sensor Interfacing and Python Programming</w:t>
+                    <w:t xml:space="preserve">IoT Campus Energy Monitoring Dashboard using MQTT and Node-RED</w:t>
                   </w:r>
                 </w:p>
               </w:tc>
@@ -5267,7 +2236,7 @@
                       <w:sz w:val="32"/>
                       <w:szCs w:val="32"/>
                     </w:rPr>
-                    <w:t xml:space="preserve">10</w:t>
+                    <w:t xml:space="preserve">5</w:t>
                   </w:r>
                 </w:p>
               </w:tc>
@@ -5389,7 +2358,7 @@
                 <w:sz w:val="19"/>
                 <w:szCs w:val="19"/>
               </w:rPr>
-              <w:t xml:space="preserve">Option A: Physical Raspberry Pi + DHT11/LED/pushbutton  |  Option B: Wokwi Simulator (wokwi.com — free, browser, supports RPi) — No hardware needed</w:t>
+              <w:t xml:space="preserve">Raspberry Pi, ACS712 current sensor or DHT11 (as load proxy), PC/laptop on same LAN (Mosquitto broker + Node-RED)</w:t>
             </w:r>
           </w:p>
         </w:tc>
@@ -5467,7 +2436,7 @@
                 <w:sz w:val="19"/>
                 <w:szCs w:val="19"/>
               </w:rPr>
-              <w:t xml:space="preserve">Write Python scripts to implement THREE of the following Raspberry Pi interfacing tasks studied in Module 4 (implement all three for full marks): Task 1 — LED Blink: GPIO output, blink at 1 Hz for 10 seconds. Task 2 — Button-Controlled LED: GPIO input, LED ON while button pressed, OFF when released. Task 3 — Temperature Sensor: Read DHT11 via GPIO, print temperature and humidity every 2 seconds. Task 4 — Serial Communication: Send 'HELLO' string via UART, receive and echo back. Submit all three as separate .py files.</w:t>
+              <w:t xml:space="preserve">Problem Statement: JECC has no real-time visibility of electricity consumption across classrooms and labs. Monthly electricity bills arrive without any room-level breakdown, making it impossible to identify energy-wasting areas or enforce conservation policies. Deploy an IoT energy monitoring pipeline: a Raspberry Pi reads current draw from an ACS712 sensor (measuring a real load such as a fan or lamp) every 5 seconds and computes approximate power (Watts = current x 230V). It publishes JSON payloads to a topic per room (campus/room/ECE_lab/power) on a Mosquitto MQTT broker running on a LAN PC. A Node-RED flow subscribes to all room topics, calculates running energy consumed (kWh), raises an ALERT when power exceeds a set threshold (indicating unusual load), and renders a live dashboard with: per-room power gauge, energy trend chart, total campus power panel, and alert log. The Mosquitto broker must use username/password authentication. This implements the complete IoT stack — sensing, communication, processing, and visualisation — as described in Module 1.</w:t>
             </w:r>
           </w:p>
         </w:tc>
@@ -5545,7 +2514,7 @@
                 <w:sz w:val="19"/>
                 <w:szCs w:val="19"/>
               </w:rPr>
-              <w:t xml:space="preserve">• led_blink.py — with GPIO setup, loop, and cleanup</w:t>
+              <w:t xml:space="preserve">• rpi_energy.py — ACS712 read, power compute, JSON publish over MQTT QoS 1 with comments</w:t>
             </w:r>
           </w:p>
           <w:p>
@@ -5564,7 +2533,7 @@
                 <w:sz w:val="19"/>
                 <w:szCs w:val="19"/>
               </w:rPr>
-              <w:t xml:space="preserve">• button_led.py — with interrupt or polling, with debounce</w:t>
+              <w:t xml:space="preserve">• mosquitto.conf — authentication config (password file + listener settings)</w:t>
             </w:r>
           </w:p>
           <w:p>
@@ -5583,7 +2552,7 @@
                 <w:sz w:val="19"/>
                 <w:szCs w:val="19"/>
               </w:rPr>
-              <w:t xml:space="preserve">• dht11_sensor.py (or serial_comm.py) — third task of your choice</w:t>
+              <w:t xml:space="preserve">• Node-RED flow export (.json) — subscribe, compute kWh, threshold alert, dashboard</w:t>
             </w:r>
           </w:p>
           <w:p>
@@ -5602,7 +2571,7 @@
                 <w:sz w:val="19"/>
                 <w:szCs w:val="19"/>
               </w:rPr>
-              <w:t xml:space="preserve">• Screenshots / Wokwi simulation screenshots showing working output</w:t>
+              <w:t xml:space="preserve">• Dashboard screenshot: per-room gauge, trend chart, alert triggered at threshold, energy total</w:t>
             </w:r>
           </w:p>
           <w:p>
@@ -5621,26 +2590,7 @@
                 <w:sz w:val="19"/>
                 <w:szCs w:val="19"/>
               </w:rPr>
-              <w:t xml:space="preserve">• Wokwi shareable link OR physical hardware demo video (max 2 min)</w:t>
-            </w:r>
-          </w:p>
-          <w:p>
-            <w:pPr>
-              <w:spacing w:after="30" w:before="0"/>
-              <w:jc w:val="left"/>
-            </w:pPr>
-            <w:r>
-              <w:rPr>
-                <w:rFonts w:ascii="Arial" w:cs="Arial" w:eastAsia="Arial" w:hAnsi="Arial"/>
-                <w:b w:val="false"/>
-                <w:bCs w:val="false"/>
-                <w:i w:val="false"/>
-                <w:iCs w:val="false"/>
-                <w:color w:val="000000"/>
-                <w:sz w:val="19"/>
-                <w:szCs w:val="19"/>
-              </w:rPr>
-              <w:t xml:space="preserve">• One-page report: GPIO pin mapping, circuit diagram, Python library used, issues faced</w:t>
+              <w:t xml:space="preserve">• One-page report: MQTT topic hierarchy designed, QoS level chosen and justification, architecture diagram (sensor to broker to dashboard), estimated monthly savings if deployed campus-wide</w:t>
             </w:r>
           </w:p>
         </w:tc>
@@ -5769,7 +2719,7 @@
                       <w:sz w:val="18"/>
                       <w:szCs w:val="18"/>
                     </w:rPr>
-                    <w:t xml:space="preserve">   |   Module 1, 2 &amp; 4   |   CO2, CO5</w:t>
+                    <w:t xml:space="preserve">   |   Module 1, 2 &amp; 3   |   CO1, CO2, CO3</w:t>
                   </w:r>
                 </w:p>
                 <w:p>
@@ -5788,7 +2738,7 @@
                       <w:sz w:val="24"/>
                       <w:szCs w:val="24"/>
                     </w:rPr>
-                    <w:t xml:space="preserve">Smart Irrigation System — End-to-End IoT Project (Tinkercad + Python Dashboard)</w:t>
+                    <w:t xml:space="preserve">Smart Campus Water Tank Monitoring with ZigBee and Cloud Alert</w:t>
                   </w:r>
                 </w:p>
               </w:tc>
@@ -5845,7 +2795,7 @@
                       <w:sz w:val="32"/>
                       <w:szCs w:val="32"/>
                     </w:rPr>
-                    <w:t xml:space="preserve">10</w:t>
+                    <w:t xml:space="preserve">5</w:t>
                   </w:r>
                 </w:p>
               </w:tc>
@@ -5967,7 +2917,7 @@
                 <w:sz w:val="19"/>
                 <w:szCs w:val="19"/>
               </w:rPr>
-              <w:t xml:space="preserve">Tinkercad Circuits (Arduino simulation) + Python + matplotlib (pip install matplotlib) — No hardware required</w:t>
+              <w:t xml:space="preserve">Arduino Uno, HC-SR04 ultrasonic sensor, 2x XBee ZigBee module (Series 2) + USB adapter, relay + LED (pump indicator), Raspberry Pi or PC as coordinator</w:t>
             </w:r>
           </w:p>
         </w:tc>
@@ -6045,7 +2995,7 @@
                 <w:sz w:val="19"/>
                 <w:szCs w:val="19"/>
               </w:rPr>
-              <w:t xml:space="preserve">Build a complete two-part smart irrigation system: PART 1 (Tinkercad): Simulate the hardware layer — Arduino reads a soil moisture sensor (use potentiometer as substitute), controls a water pump relay (LED as indicator), and displays moisture % on LCD. Publish readings on Serial Monitor. PART 2 (Python): Write a Python script that generates simulated moisture data and plots a live graph (matplotlib animation) showing moisture level over time, with a red alert line at 30% (irrigation threshold). This project demonstrates IoT Levels (Module 1), Smart Object sensing (Module 2), and programming (Module 4).</w:t>
+              <w:t xml:space="preserve">Problem Statement: JECC overhead water tanks frequently overflow — wasting water and causing seepage damage — or run dry during peak usage hours, cutting water supply to washrooms and labs. There is no automated monitoring or alert system; the pump is controlled manually by the maintenance staff who are not always available. Design a ZigBee-based smart water tank monitoring system where an Arduino end-device node mounted near the overhead tank measures water level using an HC-SR04 ultrasonic sensor every 10 seconds and computes fill percentage. If level drops below 20% (low), the node activates a relay to start the pump motor (LED as indicator); if level exceeds 90% (full/overflow risk), it stops the pump. The node transmits level %, pump state, and node ID as a ZigBee packet to a coordinator unit (XBee on USB connected to PC/RPi in the office). A Python coordinator script reads incoming ZigBee data, displays a live level bar in the terminal, pushes readings to ThingSpeak cloud every minute, and sends an overflow/dry warning to the terminal with a buzzer. This applies ZigBee mesh networking (Module 3), smart sensing objects (Module 2), and IoT architecture classification (Module 1).</w:t>
             </w:r>
           </w:p>
         </w:tc>
@@ -6123,7 +3073,7 @@
                 <w:sz w:val="19"/>
                 <w:szCs w:val="19"/>
               </w:rPr>
-              <w:t xml:space="preserve">• Part 1: Tinkercad circuit screenshot + shareable link</w:t>
+              <w:t xml:space="preserve">• Circuit diagram: Arduino + HC-SR04 + XBee end-device with relay/LED pump indicator</w:t>
             </w:r>
           </w:p>
           <w:p>
@@ -6142,7 +3092,7 @@
                 <w:sz w:val="19"/>
                 <w:szCs w:val="19"/>
               </w:rPr>
-              <w:t xml:space="preserve">• Part 1: Arduino code (.ino) with serial output screenshot</w:t>
+              <w:t xml:space="preserve">• tank_node.ino — ultrasonic level read, pump relay control (20%/90% thresholds), ZigBee packet transmit</w:t>
             </w:r>
           </w:p>
           <w:p>
@@ -6161,7 +3111,7 @@
                 <w:sz w:val="19"/>
                 <w:szCs w:val="19"/>
               </w:rPr>
-              <w:t xml:space="preserve">• Part 2: irrigation_dashboard.py — live matplotlib graph</w:t>
+              <w:t xml:space="preserve">• coordinator.py — XBee serial read, level % bar display, ThingSpeak HTTP push, terminal alert</w:t>
             </w:r>
           </w:p>
           <w:p>
@@ -6180,7 +3130,7 @@
                 <w:sz w:val="19"/>
                 <w:szCs w:val="19"/>
               </w:rPr>
-              <w:t xml:space="preserve">• Part 2: Screenshot of running dashboard showing moisture trend and threshold alert</w:t>
+              <w:t xml:space="preserve">• ThingSpeak dashboard screenshot: water level trend chart and pump state field over 10+ minutes</w:t>
             </w:r>
           </w:p>
           <w:p>
@@ -6199,26 +3149,7 @@
                 <w:sz w:val="19"/>
                 <w:szCs w:val="19"/>
               </w:rPr>
-              <w:t xml:space="preserve">• One-page report: map this project to IoT architecture layers and identify which IoT Level (1–6) it belongs to, with justification</w:t>
-            </w:r>
-          </w:p>
-          <w:p>
-            <w:pPr>
-              <w:spacing w:after="30" w:before="0"/>
-              <w:jc w:val="left"/>
-            </w:pPr>
-            <w:r>
-              <w:rPr>
-                <w:rFonts w:ascii="Arial" w:cs="Arial" w:eastAsia="Arial" w:hAnsi="Arial"/>
-                <w:b w:val="false"/>
-                <w:bCs w:val="false"/>
-                <w:i w:val="false"/>
-                <w:iCs w:val="false"/>
-                <w:color w:val="000000"/>
-                <w:sz w:val="19"/>
-                <w:szCs w:val="19"/>
-              </w:rPr>
-              <w:t xml:space="preserve">• Bonus (extra mark): Connect Part 1 serial output to Part 2 Python dashboard using pyserial</w:t>
+              <w:t xml:space="preserve">• One-page report: HC-SR04 distance-to-percentage formula used, ZigBee API/AT mode selected and why, ThingSpeak channel setup, IoT level classification, how system scales to multiple tanks across campus</w:t>
             </w:r>
           </w:p>
         </w:tc>
@@ -6293,7 +3224,7 @@
                 <w:sz w:val="22"/>
                 <w:szCs w:val="22"/>
               </w:rPr>
-              <w:t xml:space="preserve">Marking Rubric — Both Sets</w:t>
+              <w:t xml:space="preserve">Marking Rubric — Project Assignments (Set B)</w:t>
             </w:r>
           </w:p>
         </w:tc>
@@ -6391,7 +3322,7 @@
                 <w:sz w:val="20"/>
                 <w:szCs w:val="20"/>
               </w:rPr>
-              <w:t xml:space="preserve">Excellent (9–10)</w:t>
+              <w:t xml:space="preserve">Excellent (5)</w:t>
             </w:r>
           </w:p>
         </w:tc>
@@ -6429,7 +3360,7 @@
                 <w:sz w:val="20"/>
                 <w:szCs w:val="20"/>
               </w:rPr>
-              <w:t xml:space="preserve">Good (7–8)</w:t>
+              <w:t xml:space="preserve">Good (4)</w:t>
             </w:r>
           </w:p>
         </w:tc>
@@ -6467,7 +3398,7 @@
                 <w:sz w:val="20"/>
                 <w:szCs w:val="20"/>
               </w:rPr>
-              <w:t xml:space="preserve">Average (5–6)</w:t>
+              <w:t xml:space="preserve">Average (3)</w:t>
             </w:r>
           </w:p>
         </w:tc>
@@ -6505,7 +3436,7 @@
                 <w:sz w:val="20"/>
                 <w:szCs w:val="20"/>
               </w:rPr>
-              <w:t xml:space="preserve">Below Average (&lt;5)</w:t>
+              <w:t xml:space="preserve">Below Average (1–2)</w:t>
             </w:r>
           </w:p>
         </w:tc>
@@ -7304,7 +4235,7 @@
           <w:sz w:val="18"/>
           <w:szCs w:val="18"/>
         </w:rPr>
-        <w:t xml:space="preserve">Note: Marks from Set A contribute to 'Evaluate' component (10 marks) and Set B to 'Analyse' component (10 marks) of CIE. Both sets are compulsory.</w:t>
+        <w:t xml:space="preserve">Note: Project marks contribute to the 'Analyse' component (5 marks) of CIE. Each group submits one project. Individual marks are based on viva performance.</w:t>
       </w:r>
     </w:p>
     <w:sectPr>
@@ -7378,7 +4309,7 @@
         <w:sz w:val="16"/>
         <w:szCs w:val="16"/>
       </w:rPr>
-      <w:t xml:space="preserve">Academic Year 2025–26  |  Set A: 5 Reports (10 marks)  |  Set B: 5 Projects (10 marks)</w:t>
+      <w:t xml:space="preserve">Academic Year 2025–26  |  Set B: 5 Projects  |  5 marks each  |  Group submissions</w:t>
     </w:r>
     <w:r>
       <w:rPr>

</xml_diff>